<commit_message>
day 18 home tasks
</commit_message>
<xml_diff>
--- a/DaywiseDocs/10096255_Day18.docx
+++ b/DaywiseDocs/10096255_Day18.docx
@@ -19,13 +19,26 @@
     </w:p>
     <w:p>
       <w:r>
-        <w:t>What is sed?</w:t>
-      </w:r>
-    </w:p>
-    <w:p/>
-    <w:p>
-      <w:r>
-        <w:t>sed stands for Stream Editor. It is mainly used to search, replace, delete, and print specific lines from a file.</w:t>
+        <w:t xml:space="preserve">What is </w:t>
+      </w:r>
+      <w:proofErr w:type="spellStart"/>
+      <w:r>
+        <w:t>sed</w:t>
+      </w:r>
+      <w:proofErr w:type="spellEnd"/>
+      <w:r>
+        <w:t>?</w:t>
+      </w:r>
+    </w:p>
+    <w:p/>
+    <w:p>
+      <w:proofErr w:type="spellStart"/>
+      <w:r>
+        <w:t>sed</w:t>
+      </w:r>
+      <w:proofErr w:type="spellEnd"/>
+      <w:r>
+        <w:t xml:space="preserve"> stands for Stream Editor. It is mainly used to search, replace, delete, and print specific lines from a file.</w:t>
       </w:r>
     </w:p>
     <w:p/>
@@ -49,12 +62,22 @@
     <w:p/>
     <w:p>
       <w:r>
-        <w:t>1. Display file using sed</w:t>
-      </w:r>
-    </w:p>
-    <w:p>
-      <w:r>
-        <w:t>sed '' filename.txt</w:t>
+        <w:t xml:space="preserve">1. Display file using </w:t>
+      </w:r>
+      <w:proofErr w:type="spellStart"/>
+      <w:r>
+        <w:t>sed</w:t>
+      </w:r>
+      <w:proofErr w:type="spellEnd"/>
+    </w:p>
+    <w:p>
+      <w:proofErr w:type="spellStart"/>
+      <w:r>
+        <w:t>sed</w:t>
+      </w:r>
+      <w:proofErr w:type="spellEnd"/>
+      <w:r>
+        <w:t xml:space="preserve"> '' filename.txt</w:t>
       </w:r>
     </w:p>
     <w:p/>
@@ -66,7 +89,23 @@
     <w:p/>
     <w:p>
       <w:r>
-        <w:t>Note: sed filename.txt is not the usual syntax. sed expects a command/script first.</w:t>
+        <w:t xml:space="preserve">Note: </w:t>
+      </w:r>
+      <w:proofErr w:type="spellStart"/>
+      <w:r>
+        <w:t>sed</w:t>
+      </w:r>
+      <w:proofErr w:type="spellEnd"/>
+      <w:r>
+        <w:t xml:space="preserve"> filename.txt is not the usual syntax. </w:t>
+      </w:r>
+      <w:proofErr w:type="spellStart"/>
+      <w:r>
+        <w:t>sed</w:t>
+      </w:r>
+      <w:proofErr w:type="spellEnd"/>
+      <w:r>
+        <w:t xml:space="preserve"> expects a command/script first.</w:t>
       </w:r>
     </w:p>
     <w:p/>
@@ -76,8 +115,13 @@
       </w:r>
     </w:p>
     <w:p>
-      <w:r>
-        <w:t>sed 's/old/new/' filename.txt</w:t>
+      <w:proofErr w:type="spellStart"/>
+      <w:r>
+        <w:t>sed</w:t>
+      </w:r>
+      <w:proofErr w:type="spellEnd"/>
+      <w:r>
+        <w:t xml:space="preserve"> 's/old/new/' filename.txt</w:t>
       </w:r>
     </w:p>
     <w:p/>
@@ -99,8 +143,13 @@
       </w:r>
     </w:p>
     <w:p>
-      <w:r>
-        <w:t>sed 's/old/new/g' filename.txt</w:t>
+      <w:proofErr w:type="spellStart"/>
+      <w:r>
+        <w:t>sed</w:t>
+      </w:r>
+      <w:proofErr w:type="spellEnd"/>
+      <w:r>
+        <w:t xml:space="preserve"> 's/old/new/g' filename.txt</w:t>
       </w:r>
     </w:p>
     <w:p/>
@@ -122,8 +171,13 @@
       </w:r>
     </w:p>
     <w:p>
-      <w:r>
-        <w:t>sed '/word/d' filename.txt</w:t>
+      <w:proofErr w:type="spellStart"/>
+      <w:r>
+        <w:t>sed</w:t>
+      </w:r>
+      <w:proofErr w:type="spellEnd"/>
+      <w:r>
+        <w:t xml:space="preserve"> '/word/d' filename.txt</w:t>
       </w:r>
     </w:p>
     <w:p/>
@@ -145,8 +199,13 @@
       </w:r>
     </w:p>
     <w:p>
-      <w:r>
-        <w:t>sed -n '3p' filename.txt</w:t>
+      <w:proofErr w:type="spellStart"/>
+      <w:r>
+        <w:t>sed</w:t>
+      </w:r>
+      <w:proofErr w:type="spellEnd"/>
+      <w:r>
+        <w:t xml:space="preserve"> -n '3p' filename.txt</w:t>
       </w:r>
     </w:p>
     <w:p/>
@@ -172,8 +231,13 @@
       </w:r>
     </w:p>
     <w:p>
-      <w:r>
-        <w:t>sed -n '2,5p' filename.txt</w:t>
+      <w:proofErr w:type="spellStart"/>
+      <w:r>
+        <w:t>sed</w:t>
+      </w:r>
+      <w:proofErr w:type="spellEnd"/>
+      <w:r>
+        <w:t xml:space="preserve"> -n '2,5p' filename.txt</w:t>
       </w:r>
     </w:p>
     <w:p/>
@@ -386,8 +450,13 @@
     </w:p>
     <w:p/>
     <w:p>
-      <w:r>
-        <w:t>So this prints the total number of lines.</w:t>
+      <w:proofErr w:type="gramStart"/>
+      <w:r>
+        <w:t>So</w:t>
+      </w:r>
+      <w:proofErr w:type="gramEnd"/>
+      <w:r>
+        <w:t xml:space="preserve"> this prints the total number of lines.</w:t>
       </w:r>
     </w:p>
     <w:p/>
@@ -516,8 +585,13 @@
     </w:p>
     <w:p/>
     <w:p>
-      <w:r>
-        <w:t>openssl version</w:t>
+      <w:proofErr w:type="spellStart"/>
+      <w:r>
+        <w:t>openssl</w:t>
+      </w:r>
+      <w:proofErr w:type="spellEnd"/>
+      <w:r>
+        <w:t xml:space="preserve"> version</w:t>
       </w:r>
     </w:p>
     <w:p/>
@@ -545,8 +619,29 @@
       </w:r>
     </w:p>
     <w:p>
-      <w:r>
-        <w:t>openssl genrsa -out localhost.key 2048</w:t>
+      <w:proofErr w:type="spellStart"/>
+      <w:r>
+        <w:t>openssl</w:t>
+      </w:r>
+      <w:proofErr w:type="spellEnd"/>
+      <w:r>
+        <w:t xml:space="preserve"> </w:t>
+      </w:r>
+      <w:proofErr w:type="spellStart"/>
+      <w:r>
+        <w:t>genrsa</w:t>
+      </w:r>
+      <w:proofErr w:type="spellEnd"/>
+      <w:r>
+        <w:t xml:space="preserve"> -out </w:t>
+      </w:r>
+      <w:proofErr w:type="spellStart"/>
+      <w:r>
+        <w:t>localhost.key</w:t>
+      </w:r>
+      <w:proofErr w:type="spellEnd"/>
+      <w:r>
+        <w:t xml:space="preserve"> 2048</w:t>
       </w:r>
     </w:p>
     <w:p/>
@@ -563,9 +658,11 @@
     </w:p>
     <w:p/>
     <w:p>
+      <w:proofErr w:type="spellStart"/>
       <w:r>
         <w:t>localhost.key</w:t>
       </w:r>
+      <w:proofErr w:type="spellEnd"/>
     </w:p>
     <w:p>
       <w:r>
@@ -580,9 +677,35 @@
     </w:p>
     <w:p/>
     <w:p>
-      <w:r>
-        <w:t>openssl req -new -key localhost.key -out localhost.csr</w:t>
-      </w:r>
+      <w:proofErr w:type="spellStart"/>
+      <w:r>
+        <w:t>openssl</w:t>
+      </w:r>
+      <w:proofErr w:type="spellEnd"/>
+      <w:r>
+        <w:t xml:space="preserve"> </w:t>
+      </w:r>
+      <w:proofErr w:type="spellStart"/>
+      <w:r>
+        <w:t>req</w:t>
+      </w:r>
+      <w:proofErr w:type="spellEnd"/>
+      <w:r>
+        <w:t xml:space="preserve"> -new -key </w:t>
+      </w:r>
+      <w:proofErr w:type="spellStart"/>
+      <w:r>
+        <w:t>localhost.key</w:t>
+      </w:r>
+      <w:proofErr w:type="spellEnd"/>
+      <w:r>
+        <w:t xml:space="preserve"> -out </w:t>
+      </w:r>
+      <w:proofErr w:type="spellStart"/>
+      <w:r>
+        <w:t>localhost.csr</w:t>
+      </w:r>
+      <w:proofErr w:type="spellEnd"/>
     </w:p>
     <w:p/>
     <w:p>
@@ -592,10 +715,12 @@
     </w:p>
     <w:p/>
     <w:p>
+      <w:proofErr w:type="spellStart"/>
       <w:r>
         <w:lastRenderedPageBreak/>
         <w:t>localhost.csr</w:t>
       </w:r>
+      <w:proofErr w:type="spellEnd"/>
     </w:p>
     <w:p/>
     <w:p>
@@ -610,8 +735,45 @@
       </w:r>
     </w:p>
     <w:p>
-      <w:r>
-        <w:t>openssl x509 -req -days 365 -in localhost.csr -signkey localhost.key -out localhost.crt</w:t>
+      <w:proofErr w:type="spellStart"/>
+      <w:r>
+        <w:t>openssl</w:t>
+      </w:r>
+      <w:proofErr w:type="spellEnd"/>
+      <w:r>
+        <w:t xml:space="preserve"> x509 -</w:t>
+      </w:r>
+      <w:proofErr w:type="spellStart"/>
+      <w:r>
+        <w:t>req</w:t>
+      </w:r>
+      <w:proofErr w:type="spellEnd"/>
+      <w:r>
+        <w:t xml:space="preserve"> -days 365 -in </w:t>
+      </w:r>
+      <w:proofErr w:type="spellStart"/>
+      <w:r>
+        <w:t>localhost.csr</w:t>
+      </w:r>
+      <w:proofErr w:type="spellEnd"/>
+      <w:r>
+        <w:t xml:space="preserve"> -</w:t>
+      </w:r>
+      <w:proofErr w:type="spellStart"/>
+      <w:r>
+        <w:t>signkey</w:t>
+      </w:r>
+      <w:proofErr w:type="spellEnd"/>
+      <w:r>
+        <w:t xml:space="preserve"> </w:t>
+      </w:r>
+      <w:proofErr w:type="spellStart"/>
+      <w:r>
+        <w:t>localhost.key</w:t>
+      </w:r>
+      <w:proofErr w:type="spellEnd"/>
+      <w:r>
+        <w:t xml:space="preserve"> -out localhost.crt</w:t>
       </w:r>
     </w:p>
     <w:p/>
@@ -645,14 +807,18 @@
     </w:p>
     <w:p/>
     <w:p>
+      <w:proofErr w:type="spellStart"/>
       <w:r>
         <w:t>cert.pem</w:t>
       </w:r>
-    </w:p>
-    <w:p>
+      <w:proofErr w:type="spellEnd"/>
+    </w:p>
+    <w:p>
+      <w:proofErr w:type="spellStart"/>
       <w:r>
         <w:t>key.pem</w:t>
       </w:r>
+      <w:proofErr w:type="spellEnd"/>
     </w:p>
     <w:p/>
     <w:p>
@@ -667,14 +833,47 @@
       </w:r>
     </w:p>
     <w:p>
+      <w:proofErr w:type="spellStart"/>
       <w:r>
         <w:t>localhost.key</w:t>
       </w:r>
-    </w:p>
-    <w:p/>
-    <w:p>
-      <w:r>
-        <w:t>So the filenames need to match. Also, Python's built-in http.server SSL options vary by Python version; if your Python version doesn't support --ssl-certfile/--ssl-keyfile, you'll need a small Python HTTPS server script instead.</w:t>
+      <w:proofErr w:type="spellEnd"/>
+    </w:p>
+    <w:p/>
+    <w:p>
+      <w:proofErr w:type="gramStart"/>
+      <w:r>
+        <w:t>So</w:t>
+      </w:r>
+      <w:proofErr w:type="gramEnd"/>
+      <w:r>
+        <w:t xml:space="preserve"> the filenames need to match. Also, Python's built-in </w:t>
+      </w:r>
+      <w:proofErr w:type="spellStart"/>
+      <w:proofErr w:type="gramStart"/>
+      <w:r>
+        <w:t>http.server</w:t>
+      </w:r>
+      <w:proofErr w:type="spellEnd"/>
+      <w:proofErr w:type="gramEnd"/>
+      <w:r>
+        <w:t xml:space="preserve"> SSL options vary by Python version; if your Python version doesn't support --</w:t>
+      </w:r>
+      <w:proofErr w:type="spellStart"/>
+      <w:r>
+        <w:t>ssl-certfile</w:t>
+      </w:r>
+      <w:proofErr w:type="spellEnd"/>
+      <w:r>
+        <w:t>/--</w:t>
+      </w:r>
+      <w:proofErr w:type="spellStart"/>
+      <w:r>
+        <w:t>ssl-keyfile</w:t>
+      </w:r>
+      <w:proofErr w:type="spellEnd"/>
+      <w:r>
+        <w:t>, you'll need a small Python HTTPS server script instead.</w:t>
       </w:r>
     </w:p>
     <w:p/>
@@ -692,8 +891,47 @@
     <w:p/>
     <w:p>
       <w:r>
-        <w:t>python -m http.server 4443 --bind 127.0.0.1 --ssl-certfile cert.pem --ssl-keyfile key.pem</w:t>
-      </w:r>
+        <w:t xml:space="preserve">python -m </w:t>
+      </w:r>
+      <w:proofErr w:type="spellStart"/>
+      <w:proofErr w:type="gramStart"/>
+      <w:r>
+        <w:t>http.server</w:t>
+      </w:r>
+      <w:proofErr w:type="spellEnd"/>
+      <w:proofErr w:type="gramEnd"/>
+      <w:r>
+        <w:t xml:space="preserve"> 4443 --bind 127.0.0.1 --</w:t>
+      </w:r>
+      <w:proofErr w:type="spellStart"/>
+      <w:r>
+        <w:t>ssl-certfile</w:t>
+      </w:r>
+      <w:proofErr w:type="spellEnd"/>
+      <w:r>
+        <w:t xml:space="preserve"> </w:t>
+      </w:r>
+      <w:proofErr w:type="spellStart"/>
+      <w:r>
+        <w:t>cert.pem</w:t>
+      </w:r>
+      <w:proofErr w:type="spellEnd"/>
+      <w:r>
+        <w:t xml:space="preserve"> --</w:t>
+      </w:r>
+      <w:proofErr w:type="spellStart"/>
+      <w:r>
+        <w:t>ssl-keyfile</w:t>
+      </w:r>
+      <w:proofErr w:type="spellEnd"/>
+      <w:r>
+        <w:t xml:space="preserve"> </w:t>
+      </w:r>
+      <w:proofErr w:type="spellStart"/>
+      <w:r>
+        <w:t>key.pem</w:t>
+      </w:r>
+      <w:proofErr w:type="spellEnd"/>
     </w:p>
     <w:p/>
     <w:p>
@@ -732,8 +970,21 @@
       </w:r>
     </w:p>
     <w:p>
-      <w:r>
-        <w:t>openssl s_client -connect localhost:4443</w:t>
+      <w:proofErr w:type="spellStart"/>
+      <w:r>
+        <w:t>openssl</w:t>
+      </w:r>
+      <w:proofErr w:type="spellEnd"/>
+      <w:r>
+        <w:t xml:space="preserve"> </w:t>
+      </w:r>
+      <w:proofErr w:type="spellStart"/>
+      <w:r>
+        <w:t>s_client</w:t>
+      </w:r>
+      <w:proofErr w:type="spellEnd"/>
+      <w:r>
+        <w:t xml:space="preserve"> -connect localhost:4443</w:t>
       </w:r>
     </w:p>
     <w:p/>
@@ -771,8 +1022,13 @@
     <w:p/>
     <w:p>
       <w:r>
-        <w:t>Quick Revision :</w:t>
-      </w:r>
+        <w:t xml:space="preserve">Quick </w:t>
+      </w:r>
+      <w:proofErr w:type="gramStart"/>
+      <w:r>
+        <w:t>Revision :</w:t>
+      </w:r>
+      <w:proofErr w:type="gramEnd"/>
     </w:p>
     <w:p/>
     <w:p>
@@ -888,8 +1144,13 @@
     </w:p>
     <w:p>
       <w:r>
-        <w:t xml:space="preserve">     Manager    Manager</w:t>
-      </w:r>
+        <w:t xml:space="preserve">     Manager    </w:t>
+      </w:r>
+      <w:proofErr w:type="spellStart"/>
+      <w:r>
+        <w:t>Manager</w:t>
+      </w:r>
+      <w:proofErr w:type="spellEnd"/>
     </w:p>
     <w:p>
       <w:r>
@@ -1060,7 +1321,15 @@
         <w:t>root</w:t>
       </w:r>
       <w:r>
-        <w:t xml:space="preserve">, and the nodes below it are called </w:t>
+        <w:t xml:space="preserve">, and the nodes below it </w:t>
+      </w:r>
+      <w:proofErr w:type="gramStart"/>
+      <w:r>
+        <w:t>are</w:t>
+      </w:r>
+      <w:proofErr w:type="gramEnd"/>
+      <w:r>
+        <w:t xml:space="preserve"> called </w:t>
       </w:r>
       <w:r>
         <w:rPr>
@@ -1426,8 +1695,21 @@
     </w:p>
     <w:p>
       <w:r>
-        <w:t xml:space="preserve"> 20  40  60  80</w:t>
-      </w:r>
+        <w:t xml:space="preserve"> </w:t>
+      </w:r>
+      <w:proofErr w:type="gramStart"/>
+      <w:r>
+        <w:t>20  40</w:t>
+      </w:r>
+      <w:proofErr w:type="gramEnd"/>
+      <w:r>
+        <w:t xml:space="preserve">  </w:t>
+      </w:r>
+      <w:proofErr w:type="gramStart"/>
+      <w:r>
+        <w:t>60  80</w:t>
+      </w:r>
+      <w:proofErr w:type="gramEnd"/>
     </w:p>
     <w:p>
       <w:r>
@@ -1575,7 +1857,15 @@
     </w:p>
     <w:p>
       <w:r>
-        <w:t xml:space="preserve">    Node(int value) {</w:t>
+        <w:t xml:space="preserve">    </w:t>
+      </w:r>
+      <w:proofErr w:type="gramStart"/>
+      <w:r>
+        <w:t>Node(</w:t>
+      </w:r>
+      <w:proofErr w:type="gramEnd"/>
+      <w:r>
+        <w:t>int value) {</w:t>
       </w:r>
     </w:p>
     <w:p>
@@ -1606,12 +1896,36 @@
     <w:p/>
     <w:p>
       <w:r>
-        <w:t>public class BinaryTree {</w:t>
-      </w:r>
-    </w:p>
-    <w:p>
-      <w:r>
-        <w:t xml:space="preserve">    public static void main(String[] args) {</w:t>
+        <w:t xml:space="preserve">public class </w:t>
+      </w:r>
+      <w:proofErr w:type="spellStart"/>
+      <w:r>
+        <w:t>BinaryTree</w:t>
+      </w:r>
+      <w:proofErr w:type="spellEnd"/>
+      <w:r>
+        <w:t xml:space="preserve"> {</w:t>
+      </w:r>
+    </w:p>
+    <w:p>
+      <w:r>
+        <w:t xml:space="preserve">    public static void </w:t>
+      </w:r>
+      <w:proofErr w:type="gramStart"/>
+      <w:r>
+        <w:t>main(String[</w:t>
+      </w:r>
+      <w:proofErr w:type="gramEnd"/>
+      <w:r>
+        <w:t xml:space="preserve">] </w:t>
+      </w:r>
+      <w:proofErr w:type="spellStart"/>
+      <w:r>
+        <w:t>args</w:t>
+      </w:r>
+      <w:proofErr w:type="spellEnd"/>
+      <w:r>
+        <w:t>) {</w:t>
       </w:r>
     </w:p>
     <w:p>
@@ -1621,7 +1935,15 @@
     </w:p>
     <w:p>
       <w:r>
-        <w:t xml:space="preserve">        Node root = new Node(10);</w:t>
+        <w:t xml:space="preserve">        Node root = new </w:t>
+      </w:r>
+      <w:proofErr w:type="gramStart"/>
+      <w:r>
+        <w:t>Node(</w:t>
+      </w:r>
+      <w:proofErr w:type="gramEnd"/>
+      <w:r>
+        <w:t>10);</w:t>
       </w:r>
     </w:p>
     <w:p>
@@ -1631,27 +1953,113 @@
     </w:p>
     <w:p>
       <w:r>
-        <w:t xml:space="preserve">        root.left = new Node(20);</w:t>
-      </w:r>
-    </w:p>
-    <w:p>
-      <w:r>
-        <w:t xml:space="preserve">        root.right = new Node(30);</w:t>
-      </w:r>
-    </w:p>
-    <w:p>
-      <w:r>
-        <w:t xml:space="preserve">        root.left.left = new Node(40);</w:t>
-      </w:r>
-    </w:p>
-    <w:p>
-      <w:r>
-        <w:t xml:space="preserve">        root.left.right = new Node(50);</w:t>
-      </w:r>
-    </w:p>
-    <w:p>
-      <w:r>
-        <w:t xml:space="preserve">        System.out.println("Binary Tree created successfully!");</w:t>
+        <w:t xml:space="preserve">        </w:t>
+      </w:r>
+      <w:proofErr w:type="spellStart"/>
+      <w:proofErr w:type="gramStart"/>
+      <w:r>
+        <w:t>root.left</w:t>
+      </w:r>
+      <w:proofErr w:type="spellEnd"/>
+      <w:proofErr w:type="gramEnd"/>
+      <w:r>
+        <w:t xml:space="preserve"> = new </w:t>
+      </w:r>
+      <w:proofErr w:type="gramStart"/>
+      <w:r>
+        <w:t>Node(</w:t>
+      </w:r>
+      <w:proofErr w:type="gramEnd"/>
+      <w:r>
+        <w:t>20);</w:t>
+      </w:r>
+    </w:p>
+    <w:p>
+      <w:r>
+        <w:t xml:space="preserve">        </w:t>
+      </w:r>
+      <w:proofErr w:type="spellStart"/>
+      <w:proofErr w:type="gramStart"/>
+      <w:r>
+        <w:t>root.right</w:t>
+      </w:r>
+      <w:proofErr w:type="spellEnd"/>
+      <w:proofErr w:type="gramEnd"/>
+      <w:r>
+        <w:t xml:space="preserve"> = new </w:t>
+      </w:r>
+      <w:proofErr w:type="gramStart"/>
+      <w:r>
+        <w:t>Node(</w:t>
+      </w:r>
+      <w:proofErr w:type="gramEnd"/>
+      <w:r>
+        <w:t>30);</w:t>
+      </w:r>
+    </w:p>
+    <w:p>
+      <w:r>
+        <w:t xml:space="preserve">        </w:t>
+      </w:r>
+      <w:proofErr w:type="spellStart"/>
+      <w:proofErr w:type="gramStart"/>
+      <w:r>
+        <w:t>root.left</w:t>
+      </w:r>
+      <w:proofErr w:type="gramEnd"/>
+      <w:r>
+        <w:t>.left</w:t>
+      </w:r>
+      <w:proofErr w:type="spellEnd"/>
+      <w:r>
+        <w:t xml:space="preserve"> = new </w:t>
+      </w:r>
+      <w:proofErr w:type="gramStart"/>
+      <w:r>
+        <w:t>Node(</w:t>
+      </w:r>
+      <w:proofErr w:type="gramEnd"/>
+      <w:r>
+        <w:t>40);</w:t>
+      </w:r>
+    </w:p>
+    <w:p>
+      <w:r>
+        <w:t xml:space="preserve">        </w:t>
+      </w:r>
+      <w:proofErr w:type="spellStart"/>
+      <w:proofErr w:type="gramStart"/>
+      <w:r>
+        <w:t>root.left</w:t>
+      </w:r>
+      <w:proofErr w:type="gramEnd"/>
+      <w:r>
+        <w:t>.right</w:t>
+      </w:r>
+      <w:proofErr w:type="spellEnd"/>
+      <w:r>
+        <w:t xml:space="preserve"> = new </w:t>
+      </w:r>
+      <w:proofErr w:type="gramStart"/>
+      <w:r>
+        <w:t>Node(</w:t>
+      </w:r>
+      <w:proofErr w:type="gramEnd"/>
+      <w:r>
+        <w:t>50);</w:t>
+      </w:r>
+    </w:p>
+    <w:p>
+      <w:r>
+        <w:t xml:space="preserve">        </w:t>
+      </w:r>
+      <w:proofErr w:type="spellStart"/>
+      <w:r>
+        <w:t>System.out.println</w:t>
+      </w:r>
+      <w:proofErr w:type="spellEnd"/>
+      <w:r>
+        <w:t>("Binary Tree created successfully!");</w:t>
       </w:r>
     </w:p>
     <w:p>
@@ -1702,7 +2110,23 @@
     </w:p>
     <w:p>
       <w:r>
-        <w:t xml:space="preserve">    static boolean search(Node root, int number) {</w:t>
+        <w:t xml:space="preserve">    static </w:t>
+      </w:r>
+      <w:proofErr w:type="spellStart"/>
+      <w:r>
+        <w:t>boolean</w:t>
+      </w:r>
+      <w:proofErr w:type="spellEnd"/>
+      <w:r>
+        <w:t xml:space="preserve"> </w:t>
+      </w:r>
+      <w:proofErr w:type="gramStart"/>
+      <w:r>
+        <w:t>search(</w:t>
+      </w:r>
+      <w:proofErr w:type="gramEnd"/>
+      <w:r>
+        <w:t>Node root, int number) {</w:t>
       </w:r>
     </w:p>
     <w:p>
@@ -1733,7 +2157,15 @@
     </w:p>
     <w:p>
       <w:r>
-        <w:t xml:space="preserve">        if (root.data == number) {</w:t>
+        <w:t xml:space="preserve">        if (</w:t>
+      </w:r>
+      <w:proofErr w:type="spellStart"/>
+      <w:r>
+        <w:t>root.data</w:t>
+      </w:r>
+      <w:proofErr w:type="spellEnd"/>
+      <w:r>
+        <w:t xml:space="preserve"> == number) {</w:t>
       </w:r>
     </w:p>
     <w:p>
@@ -1759,7 +2191,20 @@
     </w:p>
     <w:p>
       <w:r>
-        <w:t xml:space="preserve">        if (search(root.left, number)) {</w:t>
+        <w:t xml:space="preserve">        if (</w:t>
+      </w:r>
+      <w:proofErr w:type="gramStart"/>
+      <w:r>
+        <w:t>search(</w:t>
+      </w:r>
+      <w:proofErr w:type="spellStart"/>
+      <w:r>
+        <w:t>root.left</w:t>
+      </w:r>
+      <w:proofErr w:type="spellEnd"/>
+      <w:proofErr w:type="gramEnd"/>
+      <w:r>
+        <w:t>, number)) {</w:t>
       </w:r>
     </w:p>
     <w:p>
@@ -1779,7 +2224,20 @@
     </w:p>
     <w:p>
       <w:r>
-        <w:t xml:space="preserve">        return search(root.right, number);</w:t>
+        <w:t xml:space="preserve">        return </w:t>
+      </w:r>
+      <w:proofErr w:type="gramStart"/>
+      <w:r>
+        <w:t>search(</w:t>
+      </w:r>
+      <w:proofErr w:type="spellStart"/>
+      <w:r>
+        <w:t>root.right</w:t>
+      </w:r>
+      <w:proofErr w:type="spellEnd"/>
+      <w:proofErr w:type="gramEnd"/>
+      <w:r>
+        <w:t>, number);</w:t>
       </w:r>
     </w:p>
     <w:p>
@@ -1864,7 +2322,20 @@
     </w:p>
     <w:p>
       <w:r>
-        <w:t>static void inorder(Node root) {</w:t>
+        <w:t xml:space="preserve">static void </w:t>
+      </w:r>
+      <w:proofErr w:type="spellStart"/>
+      <w:proofErr w:type="gramStart"/>
+      <w:r>
+        <w:t>inorder</w:t>
+      </w:r>
+      <w:proofErr w:type="spellEnd"/>
+      <w:r>
+        <w:t>(</w:t>
+      </w:r>
+      <w:proofErr w:type="gramEnd"/>
+      <w:r>
+        <w:t>Node root) {</w:t>
       </w:r>
     </w:p>
     <w:p>
@@ -1875,17 +2346,69 @@
     <w:p/>
     <w:p>
       <w:r>
-        <w:t xml:space="preserve">    inorder(root.left);</w:t>
-      </w:r>
-    </w:p>
-    <w:p>
-      <w:r>
-        <w:t xml:space="preserve">    System.out.print(root.data + " ");</w:t>
-      </w:r>
-    </w:p>
-    <w:p>
-      <w:r>
-        <w:t xml:space="preserve">    inorder(root.right);</w:t>
+        <w:t xml:space="preserve">    </w:t>
+      </w:r>
+      <w:proofErr w:type="spellStart"/>
+      <w:r>
+        <w:t>inorder</w:t>
+      </w:r>
+      <w:proofErr w:type="spellEnd"/>
+      <w:r>
+        <w:t>(</w:t>
+      </w:r>
+      <w:proofErr w:type="spellStart"/>
+      <w:proofErr w:type="gramStart"/>
+      <w:r>
+        <w:t>root.left</w:t>
+      </w:r>
+      <w:proofErr w:type="spellEnd"/>
+      <w:proofErr w:type="gramEnd"/>
+      <w:r>
+        <w:t>);</w:t>
+      </w:r>
+    </w:p>
+    <w:p>
+      <w:r>
+        <w:t xml:space="preserve">    </w:t>
+      </w:r>
+      <w:proofErr w:type="spellStart"/>
+      <w:r>
+        <w:t>System.out.print</w:t>
+      </w:r>
+      <w:proofErr w:type="spellEnd"/>
+      <w:r>
+        <w:t>(</w:t>
+      </w:r>
+      <w:proofErr w:type="spellStart"/>
+      <w:r>
+        <w:t>root.data</w:t>
+      </w:r>
+      <w:proofErr w:type="spellEnd"/>
+      <w:r>
+        <w:t xml:space="preserve"> + " ");</w:t>
+      </w:r>
+    </w:p>
+    <w:p>
+      <w:r>
+        <w:t xml:space="preserve">    </w:t>
+      </w:r>
+      <w:proofErr w:type="spellStart"/>
+      <w:r>
+        <w:t>inorder</w:t>
+      </w:r>
+      <w:proofErr w:type="spellEnd"/>
+      <w:r>
+        <w:t>(</w:t>
+      </w:r>
+      <w:proofErr w:type="spellStart"/>
+      <w:proofErr w:type="gramStart"/>
+      <w:r>
+        <w:t>root.right</w:t>
+      </w:r>
+      <w:proofErr w:type="spellEnd"/>
+      <w:proofErr w:type="gramEnd"/>
+      <w:r>
+        <w:t>);</w:t>
       </w:r>
     </w:p>
     <w:p>
@@ -2549,18 +3072,46 @@
     </w:p>
     <w:p>
       <w:r>
-        <w:t>HashMap&lt;Integer, String&gt; map = new HashMap&lt;&gt;();</w:t>
-      </w:r>
-    </w:p>
-    <w:p/>
-    <w:p>
-      <w:r>
-        <w:t>map.put(1, "Apple");</w:t>
-      </w:r>
-    </w:p>
-    <w:p>
-      <w:r>
-        <w:t>map.put(2, "Mango");</w:t>
+        <w:t>HashMap&lt;Integer, String&gt; map = new HashMap&lt;</w:t>
+      </w:r>
+      <w:proofErr w:type="gramStart"/>
+      <w:r>
+        <w:t>&gt;(</w:t>
+      </w:r>
+      <w:proofErr w:type="gramEnd"/>
+      <w:r>
+        <w:t>);</w:t>
+      </w:r>
+    </w:p>
+    <w:p/>
+    <w:p>
+      <w:proofErr w:type="spellStart"/>
+      <w:proofErr w:type="gramStart"/>
+      <w:r>
+        <w:t>map.put</w:t>
+      </w:r>
+      <w:proofErr w:type="spellEnd"/>
+      <w:r>
+        <w:t>(</w:t>
+      </w:r>
+      <w:proofErr w:type="gramEnd"/>
+      <w:r>
+        <w:t>1, "Apple");</w:t>
+      </w:r>
+    </w:p>
+    <w:p>
+      <w:proofErr w:type="spellStart"/>
+      <w:proofErr w:type="gramStart"/>
+      <w:r>
+        <w:t>map.put</w:t>
+      </w:r>
+      <w:proofErr w:type="spellEnd"/>
+      <w:r>
+        <w:t>(</w:t>
+      </w:r>
+      <w:proofErr w:type="gramEnd"/>
+      <w:r>
+        <w:t>2, "Mango");</w:t>
       </w:r>
     </w:p>
     <w:p>
@@ -2644,8 +3195,29 @@
           <w:numId w:val="8"/>
         </w:numPr>
       </w:pPr>
-      <w:r>
-        <w:t>equals() is used to check whether the key is actually the same.</w:t>
+      <w:proofErr w:type="gramStart"/>
+      <w:r>
+        <w:t>equals(</w:t>
+      </w:r>
+      <w:proofErr w:type="gramEnd"/>
+      <w:r>
+        <w:t xml:space="preserve">) </w:t>
+      </w:r>
+      <w:proofErr w:type="gramStart"/>
+      <w:r>
+        <w:t>is</w:t>
+      </w:r>
+      <w:proofErr w:type="gramEnd"/>
+      <w:r>
+        <w:t xml:space="preserve"> used to check whether the key is </w:t>
+      </w:r>
+      <w:proofErr w:type="gramStart"/>
+      <w:r>
+        <w:t>actually the</w:t>
+      </w:r>
+      <w:proofErr w:type="gramEnd"/>
+      <w:r>
+        <w:t xml:space="preserve"> same.</w:t>
       </w:r>
     </w:p>
     <w:p>
@@ -2710,12 +3282,21 @@
       <w:r>
         <w:t xml:space="preserve">Because HashMap uses keys, checking whether an element exists is generally </w:t>
       </w:r>
-      <w:r>
-        <w:rPr>
-          <w:b/>
-          <w:bCs/>
-        </w:rPr>
-        <w:t>O(1) average time</w:t>
+      <w:proofErr w:type="gramStart"/>
+      <w:r>
+        <w:rPr>
+          <w:b/>
+          <w:bCs/>
+        </w:rPr>
+        <w:t>O(</w:t>
+      </w:r>
+      <w:proofErr w:type="gramEnd"/>
+      <w:r>
+        <w:rPr>
+          <w:b/>
+          <w:bCs/>
+        </w:rPr>
+        <w:t>1) average time</w:t>
       </w:r>
       <w:r>
         <w:t>.</w:t>
@@ -2925,18 +3506,46 @@
     </w:p>
     <w:p>
       <w:r>
-        <w:t>HashMap&lt;Integer, String&gt; map = new HashMap&lt;&gt;();</w:t>
-      </w:r>
-    </w:p>
-    <w:p/>
-    <w:p>
-      <w:r>
-        <w:t>map.put(1, "A");</w:t>
-      </w:r>
-    </w:p>
-    <w:p>
-      <w:r>
-        <w:t>map.put(2, "B");</w:t>
+        <w:t>HashMap&lt;Integer, String&gt; map = new HashMap&lt;</w:t>
+      </w:r>
+      <w:proofErr w:type="gramStart"/>
+      <w:r>
+        <w:t>&gt;(</w:t>
+      </w:r>
+      <w:proofErr w:type="gramEnd"/>
+      <w:r>
+        <w:t>);</w:t>
+      </w:r>
+    </w:p>
+    <w:p/>
+    <w:p>
+      <w:proofErr w:type="spellStart"/>
+      <w:proofErr w:type="gramStart"/>
+      <w:r>
+        <w:t>map.put</w:t>
+      </w:r>
+      <w:proofErr w:type="spellEnd"/>
+      <w:r>
+        <w:t>(</w:t>
+      </w:r>
+      <w:proofErr w:type="gramEnd"/>
+      <w:r>
+        <w:t>1, "A");</w:t>
+      </w:r>
+    </w:p>
+    <w:p>
+      <w:proofErr w:type="spellStart"/>
+      <w:proofErr w:type="gramStart"/>
+      <w:r>
+        <w:t>map.put</w:t>
+      </w:r>
+      <w:proofErr w:type="spellEnd"/>
+      <w:r>
+        <w:t>(</w:t>
+      </w:r>
+      <w:proofErr w:type="gramEnd"/>
+      <w:r>
+        <w:t>2, "B");</w:t>
       </w:r>
     </w:p>
     <w:p>
@@ -3040,7 +3649,15 @@
         <w:t>null values</w:t>
       </w:r>
       <w:r>
-        <w:t xml:space="preserve"> and also allows </w:t>
+        <w:t xml:space="preserve"> </w:t>
+      </w:r>
+      <w:proofErr w:type="gramStart"/>
+      <w:r>
+        <w:t>and also</w:t>
+      </w:r>
+      <w:proofErr w:type="gramEnd"/>
+      <w:r>
+        <w:t xml:space="preserve"> allows </w:t>
       </w:r>
       <w:r>
         <w:rPr>
@@ -3060,42 +3677,140 @@
     </w:p>
     <w:p>
       <w:r>
-        <w:t>import java.util.*;</w:t>
-      </w:r>
-    </w:p>
-    <w:p/>
-    <w:p>
-      <w:r>
-        <w:t>public class InterviewBit {</w:t>
-      </w:r>
-    </w:p>
-    <w:p>
-      <w:r>
-        <w:t xml:space="preserve">    public static void main(String[] args) {</w:t>
-      </w:r>
-    </w:p>
-    <w:p/>
-    <w:p>
-      <w:r>
-        <w:t xml:space="preserve">        HashMap&lt;Integer, String&gt; hmap = new HashMap&lt;&gt;();</w:t>
-      </w:r>
-    </w:p>
-    <w:p/>
-    <w:p>
-      <w:r>
-        <w:t xml:space="preserve">        hmap.put(1, "Program to store null value");</w:t>
-      </w:r>
-    </w:p>
-    <w:p>
-      <w:r>
-        <w:t xml:space="preserve">        hmap.put(null, "InterviewBit");</w:t>
+        <w:t xml:space="preserve">import </w:t>
+      </w:r>
+      <w:proofErr w:type="spellStart"/>
+      <w:r>
+        <w:t>java.util</w:t>
+      </w:r>
+      <w:proofErr w:type="spellEnd"/>
+      <w:r>
+        <w:t>.*;</w:t>
+      </w:r>
+    </w:p>
+    <w:p/>
+    <w:p>
+      <w:r>
+        <w:t xml:space="preserve">public class </w:t>
+      </w:r>
+      <w:proofErr w:type="spellStart"/>
+      <w:r>
+        <w:t>InterviewBit</w:t>
+      </w:r>
+      <w:proofErr w:type="spellEnd"/>
+      <w:r>
+        <w:t xml:space="preserve"> {</w:t>
+      </w:r>
+    </w:p>
+    <w:p>
+      <w:r>
+        <w:t xml:space="preserve">    public static void </w:t>
+      </w:r>
+      <w:proofErr w:type="gramStart"/>
+      <w:r>
+        <w:t>main(String[</w:t>
+      </w:r>
+      <w:proofErr w:type="gramEnd"/>
+      <w:r>
+        <w:t xml:space="preserve">] </w:t>
+      </w:r>
+      <w:proofErr w:type="spellStart"/>
+      <w:r>
+        <w:t>args</w:t>
+      </w:r>
+      <w:proofErr w:type="spellEnd"/>
+      <w:r>
+        <w:t>) {</w:t>
+      </w:r>
+    </w:p>
+    <w:p/>
+    <w:p>
+      <w:r>
+        <w:t xml:space="preserve">        HashMap&lt;Integer, String&gt; </w:t>
+      </w:r>
+      <w:proofErr w:type="spellStart"/>
+      <w:r>
+        <w:t>hmap</w:t>
+      </w:r>
+      <w:proofErr w:type="spellEnd"/>
+      <w:r>
+        <w:t xml:space="preserve"> = new HashMap&lt;</w:t>
+      </w:r>
+      <w:proofErr w:type="gramStart"/>
+      <w:r>
+        <w:t>&gt;(</w:t>
+      </w:r>
+      <w:proofErr w:type="gramEnd"/>
+      <w:r>
+        <w:t>);</w:t>
+      </w:r>
+    </w:p>
+    <w:p/>
+    <w:p>
+      <w:r>
+        <w:t xml:space="preserve">        </w:t>
+      </w:r>
+      <w:proofErr w:type="spellStart"/>
+      <w:proofErr w:type="gramStart"/>
+      <w:r>
+        <w:t>hmap.put</w:t>
+      </w:r>
+      <w:proofErr w:type="spellEnd"/>
+      <w:r>
+        <w:t>(</w:t>
+      </w:r>
+      <w:proofErr w:type="gramEnd"/>
+      <w:r>
+        <w:t>1, "Program to store null value");</w:t>
+      </w:r>
+    </w:p>
+    <w:p>
+      <w:r>
+        <w:t xml:space="preserve">        </w:t>
+      </w:r>
+      <w:proofErr w:type="spellStart"/>
+      <w:proofErr w:type="gramStart"/>
+      <w:r>
+        <w:t>hmap.put</w:t>
+      </w:r>
+      <w:proofErr w:type="spellEnd"/>
+      <w:r>
+        <w:t>(</w:t>
+      </w:r>
+      <w:proofErr w:type="gramEnd"/>
+      <w:r>
+        <w:t>null, "</w:t>
+      </w:r>
+      <w:proofErr w:type="spellStart"/>
+      <w:r>
+        <w:t>InterviewBit</w:t>
+      </w:r>
+      <w:proofErr w:type="spellEnd"/>
+      <w:r>
+        <w:t>");</w:t>
       </w:r>
     </w:p>
     <w:p/>
     <w:p>
       <w:r>
         <w:lastRenderedPageBreak/>
-        <w:t xml:space="preserve">        System.out.println(hmap);</w:t>
+        <w:t xml:space="preserve">        </w:t>
+      </w:r>
+      <w:proofErr w:type="spellStart"/>
+      <w:r>
+        <w:t>System.out.println</w:t>
+      </w:r>
+      <w:proofErr w:type="spellEnd"/>
+      <w:r>
+        <w:t>(</w:t>
+      </w:r>
+      <w:proofErr w:type="spellStart"/>
+      <w:r>
+        <w:t>hmap</w:t>
+      </w:r>
+      <w:proofErr w:type="spellEnd"/>
+      <w:r>
+        <w:t>);</w:t>
       </w:r>
     </w:p>
     <w:p>
@@ -3125,7 +3840,15 @@
     </w:p>
     <w:p>
       <w:r>
-        <w:t>{null=InterviewBit, 1=Program to store null value}</w:t>
+        <w:t>{null=</w:t>
+      </w:r>
+      <w:proofErr w:type="spellStart"/>
+      <w:r>
+        <w:t>InterviewBit</w:t>
+      </w:r>
+      <w:proofErr w:type="spellEnd"/>
+      <w:r>
+        <w:t>, 1=Program to store null value}</w:t>
       </w:r>
     </w:p>
     <w:p>
@@ -3197,7 +3920,39 @@
           <w:b/>
           <w:bCs/>
         </w:rPr>
-        <w:t>Task 20: HashMaps in Java are not thread-safe. Can you justify?</w:t>
+        <w:t xml:space="preserve">Task 20: </w:t>
+      </w:r>
+      <w:proofErr w:type="spellStart"/>
+      <w:r>
+        <w:rPr>
+          <w:b/>
+          <w:bCs/>
+        </w:rPr>
+        <w:t>HashMaps</w:t>
+      </w:r>
+      <w:proofErr w:type="spellEnd"/>
+      <w:r>
+        <w:rPr>
+          <w:b/>
+          <w:bCs/>
+        </w:rPr>
+        <w:t xml:space="preserve"> in Java are not </w:t>
+      </w:r>
+      <w:proofErr w:type="gramStart"/>
+      <w:r>
+        <w:rPr>
+          <w:b/>
+          <w:bCs/>
+        </w:rPr>
+        <w:t>thread-safe</w:t>
+      </w:r>
+      <w:proofErr w:type="gramEnd"/>
+      <w:r>
+        <w:rPr>
+          <w:b/>
+          <w:bCs/>
+        </w:rPr>
+        <w:t>. Can you justify?</w:t>
       </w:r>
     </w:p>
     <w:p>
@@ -3226,8 +3981,13 @@
       </w:r>
     </w:p>
     <w:p>
-      <w:r>
-        <w:t>Collections.synchronizedMap()</w:t>
+      <w:proofErr w:type="spellStart"/>
+      <w:r>
+        <w:t>Collections.synchronizedMap</w:t>
+      </w:r>
+      <w:proofErr w:type="spellEnd"/>
+      <w:r>
+        <w:t>()</w:t>
       </w:r>
     </w:p>
     <w:p>
@@ -3236,9 +3996,11 @@
       </w:r>
     </w:p>
     <w:p>
+      <w:proofErr w:type="spellStart"/>
       <w:r>
         <w:t>ConcurrentHashMap</w:t>
       </w:r>
+      <w:proofErr w:type="spellEnd"/>
     </w:p>
     <w:p>
       <w:pPr>
@@ -3317,30 +4079,73 @@
     </w:p>
     <w:p>
       <w:r>
-        <w:t>HashMap&lt;Integer, String&gt; map = new HashMap&lt;&gt;();</w:t>
-      </w:r>
-    </w:p>
-    <w:p/>
-    <w:p>
-      <w:r>
-        <w:t>map.put(1, "Apple");</w:t>
-      </w:r>
-    </w:p>
-    <w:p>
+        <w:t>HashMap&lt;Integer, String&gt; map = new HashMap&lt;</w:t>
+      </w:r>
+      <w:proofErr w:type="gramStart"/>
+      <w:r>
+        <w:t>&gt;(</w:t>
+      </w:r>
+      <w:proofErr w:type="gramEnd"/>
+      <w:r>
+        <w:t>);</w:t>
+      </w:r>
+    </w:p>
+    <w:p/>
+    <w:p>
+      <w:proofErr w:type="spellStart"/>
+      <w:proofErr w:type="gramStart"/>
+      <w:r>
+        <w:t>map.put</w:t>
+      </w:r>
+      <w:proofErr w:type="spellEnd"/>
+      <w:r>
+        <w:t>(</w:t>
+      </w:r>
+      <w:proofErr w:type="gramEnd"/>
+      <w:r>
+        <w:t>1, "Apple");</w:t>
+      </w:r>
+    </w:p>
+    <w:p>
+      <w:proofErr w:type="spellStart"/>
+      <w:proofErr w:type="gramStart"/>
       <w:r>
         <w:lastRenderedPageBreak/>
-        <w:t>map.put(2, "Apple");</w:t>
-      </w:r>
-    </w:p>
-    <w:p>
-      <w:r>
-        <w:t>map.put(3, "Mango");</w:t>
-      </w:r>
-    </w:p>
-    <w:p/>
-    <w:p>
-      <w:r>
-        <w:t>System.out.println(map);</w:t>
+        <w:t>map.put</w:t>
+      </w:r>
+      <w:proofErr w:type="spellEnd"/>
+      <w:r>
+        <w:t>(</w:t>
+      </w:r>
+      <w:proofErr w:type="gramEnd"/>
+      <w:r>
+        <w:t>2, "Apple");</w:t>
+      </w:r>
+    </w:p>
+    <w:p>
+      <w:proofErr w:type="spellStart"/>
+      <w:proofErr w:type="gramStart"/>
+      <w:r>
+        <w:t>map.put</w:t>
+      </w:r>
+      <w:proofErr w:type="spellEnd"/>
+      <w:r>
+        <w:t>(</w:t>
+      </w:r>
+      <w:proofErr w:type="gramEnd"/>
+      <w:r>
+        <w:t>3, "Mango");</w:t>
+      </w:r>
+    </w:p>
+    <w:p/>
+    <w:p>
+      <w:proofErr w:type="spellStart"/>
+      <w:r>
+        <w:t>System.out.println</w:t>
+      </w:r>
+      <w:proofErr w:type="spellEnd"/>
+      <w:r>
+        <w:t>(map);</w:t>
       </w:r>
     </w:p>
     <w:p>
@@ -3401,7 +4206,23 @@
           <w:b/>
           <w:bCs/>
         </w:rPr>
-        <w:t>Task 22: Difference between HashMap and Hashtable in Java</w:t>
+        <w:t xml:space="preserve">Task 22: Difference between HashMap and </w:t>
+      </w:r>
+      <w:proofErr w:type="spellStart"/>
+      <w:r>
+        <w:rPr>
+          <w:b/>
+          <w:bCs/>
+        </w:rPr>
+        <w:t>Hashtable</w:t>
+      </w:r>
+      <w:proofErr w:type="spellEnd"/>
+      <w:r>
+        <w:rPr>
+          <w:b/>
+          <w:bCs/>
+        </w:rPr>
+        <w:t xml:space="preserve"> in Java</w:t>
       </w:r>
     </w:p>
     <w:tbl>
@@ -3460,6 +4281,7 @@
                 <w:bCs/>
               </w:rPr>
             </w:pPr>
+            <w:proofErr w:type="spellStart"/>
             <w:r>
               <w:rPr>
                 <w:b/>
@@ -3467,6 +4289,7 @@
               </w:rPr>
               <w:t>Hashtable</w:t>
             </w:r>
+            <w:proofErr w:type="spellEnd"/>
           </w:p>
         </w:tc>
       </w:tr>
@@ -3493,8 +4316,13 @@
             <w:hideMark/>
           </w:tcPr>
           <w:p>
+            <w:proofErr w:type="spellStart"/>
             <w:r>
-              <w:t>Hashtable is synchronized.</w:t>
+              <w:t>Hashtable</w:t>
+            </w:r>
+            <w:proofErr w:type="spellEnd"/>
+            <w:r>
+              <w:t xml:space="preserve"> is synchronized.</w:t>
             </w:r>
           </w:p>
         </w:tc>
@@ -3511,7 +4339,15 @@
           </w:tcPr>
           <w:p>
             <w:r>
-              <w:t>HashMap is not thread-safe.</w:t>
+              <w:t xml:space="preserve">HashMap is not </w:t>
+            </w:r>
+            <w:proofErr w:type="gramStart"/>
+            <w:r>
+              <w:t>thread-safe</w:t>
+            </w:r>
+            <w:proofErr w:type="gramEnd"/>
+            <w:r>
+              <w:t>.</w:t>
             </w:r>
           </w:p>
         </w:tc>
@@ -3522,8 +4358,21 @@
             <w:hideMark/>
           </w:tcPr>
           <w:p>
+            <w:proofErr w:type="spellStart"/>
             <w:r>
-              <w:t>Hashtable is thread-safe.</w:t>
+              <w:t>Hashtable</w:t>
+            </w:r>
+            <w:proofErr w:type="spellEnd"/>
+            <w:r>
+              <w:t xml:space="preserve"> is </w:t>
+            </w:r>
+            <w:proofErr w:type="gramStart"/>
+            <w:r>
+              <w:t>thread-safe</w:t>
+            </w:r>
+            <w:proofErr w:type="gramEnd"/>
+            <w:r>
+              <w:t>.</w:t>
             </w:r>
           </w:p>
         </w:tc>
@@ -3551,8 +4400,13 @@
             <w:hideMark/>
           </w:tcPr>
           <w:p>
+            <w:proofErr w:type="spellStart"/>
             <w:r>
-              <w:t>Hashtable does not allow null keys.</w:t>
+              <w:t>Hashtable</w:t>
+            </w:r>
+            <w:proofErr w:type="spellEnd"/>
+            <w:r>
+              <w:t xml:space="preserve"> does not allow null keys.</w:t>
             </w:r>
           </w:p>
         </w:tc>
@@ -3580,8 +4434,13 @@
             <w:hideMark/>
           </w:tcPr>
           <w:p>
+            <w:proofErr w:type="spellStart"/>
             <w:r>
-              <w:t>Hashtable does not allow null values.</w:t>
+              <w:t>Hashtable</w:t>
+            </w:r>
+            <w:proofErr w:type="spellEnd"/>
+            <w:r>
+              <w:t xml:space="preserve"> does not allow null values.</w:t>
             </w:r>
           </w:p>
         </w:tc>
@@ -3666,7 +4525,55 @@
           <w:b/>
           <w:bCs/>
         </w:rPr>
-        <w:t>HashMap is generally preferred for normal use, while Hashtable is a legacy synchronized class. For modern multithreaded applications, ConcurrentHashMap is usually preferred over Hashtable.</w:t>
+        <w:t xml:space="preserve">HashMap is generally preferred for normal use, while </w:t>
+      </w:r>
+      <w:proofErr w:type="spellStart"/>
+      <w:r>
+        <w:rPr>
+          <w:b/>
+          <w:bCs/>
+        </w:rPr>
+        <w:t>Hashtable</w:t>
+      </w:r>
+      <w:proofErr w:type="spellEnd"/>
+      <w:r>
+        <w:rPr>
+          <w:b/>
+          <w:bCs/>
+        </w:rPr>
+        <w:t xml:space="preserve"> is a legacy synchronized class. For modern multithreaded applications, </w:t>
+      </w:r>
+      <w:proofErr w:type="spellStart"/>
+      <w:r>
+        <w:rPr>
+          <w:b/>
+          <w:bCs/>
+        </w:rPr>
+        <w:t>ConcurrentHashMap</w:t>
+      </w:r>
+      <w:proofErr w:type="spellEnd"/>
+      <w:r>
+        <w:rPr>
+          <w:b/>
+          <w:bCs/>
+        </w:rPr>
+        <w:t xml:space="preserve"> is usually preferred over </w:t>
+      </w:r>
+      <w:proofErr w:type="spellStart"/>
+      <w:r>
+        <w:rPr>
+          <w:b/>
+          <w:bCs/>
+        </w:rPr>
+        <w:t>Hashtable</w:t>
+      </w:r>
+      <w:proofErr w:type="spellEnd"/>
+      <w:r>
+        <w:rPr>
+          <w:b/>
+          <w:bCs/>
+        </w:rPr>
+        <w:t>.</w:t>
       </w:r>
     </w:p>
     <w:p>
@@ -3741,53 +4648,216 @@
     </w:p>
     <w:p>
       <w:r>
-        <w:t>public class BubbleSort {</w:t>
-      </w:r>
-    </w:p>
-    <w:p/>
-    <w:p>
-      <w:r>
-        <w:t xml:space="preserve">    public static void main(String[] args) {</w:t>
-      </w:r>
-    </w:p>
-    <w:p/>
-    <w:p>
-      <w:r>
-        <w:t xml:space="preserve">        int[] arr = {5, 3, 8, 1, 2};</w:t>
-      </w:r>
-    </w:p>
-    <w:p/>
-    <w:p>
-      <w:r>
-        <w:t xml:space="preserve">        for (int i = 0; i &lt; arr.length - 1; i++) {</w:t>
-      </w:r>
-    </w:p>
-    <w:p/>
-    <w:p>
-      <w:r>
-        <w:t xml:space="preserve">            for (int j = 0; j &lt; arr.length - i - 1; j++) {</w:t>
-      </w:r>
-    </w:p>
-    <w:p/>
-    <w:p>
-      <w:r>
-        <w:t xml:space="preserve">                if (arr[j] &gt; arr[j + 1]) {</w:t>
-      </w:r>
-    </w:p>
-    <w:p/>
-    <w:p>
-      <w:r>
-        <w:t xml:space="preserve">                    int temp = arr[j];</w:t>
-      </w:r>
-    </w:p>
-    <w:p>
-      <w:r>
-        <w:t xml:space="preserve">                    arr[j] = arr[j + 1];</w:t>
-      </w:r>
-    </w:p>
-    <w:p>
-      <w:r>
-        <w:t xml:space="preserve">                    arr[j + 1] = temp;</w:t>
+        <w:t xml:space="preserve">public class </w:t>
+      </w:r>
+      <w:proofErr w:type="spellStart"/>
+      <w:r>
+        <w:t>BubbleSort</w:t>
+      </w:r>
+      <w:proofErr w:type="spellEnd"/>
+      <w:r>
+        <w:t xml:space="preserve"> {</w:t>
+      </w:r>
+    </w:p>
+    <w:p/>
+    <w:p>
+      <w:r>
+        <w:t xml:space="preserve">    public static void </w:t>
+      </w:r>
+      <w:proofErr w:type="gramStart"/>
+      <w:r>
+        <w:t>main(String[</w:t>
+      </w:r>
+      <w:proofErr w:type="gramEnd"/>
+      <w:r>
+        <w:t xml:space="preserve">] </w:t>
+      </w:r>
+      <w:proofErr w:type="spellStart"/>
+      <w:r>
+        <w:t>args</w:t>
+      </w:r>
+      <w:proofErr w:type="spellEnd"/>
+      <w:r>
+        <w:t>) {</w:t>
+      </w:r>
+    </w:p>
+    <w:p/>
+    <w:p>
+      <w:r>
+        <w:t xml:space="preserve">        </w:t>
+      </w:r>
+      <w:proofErr w:type="gramStart"/>
+      <w:r>
+        <w:t>int[</w:t>
+      </w:r>
+      <w:proofErr w:type="gramEnd"/>
+      <w:r>
+        <w:t xml:space="preserve">] </w:t>
+      </w:r>
+      <w:proofErr w:type="spellStart"/>
+      <w:r>
+        <w:t>arr</w:t>
+      </w:r>
+      <w:proofErr w:type="spellEnd"/>
+      <w:r>
+        <w:t xml:space="preserve"> = {5, 3, 8, 1, 2};</w:t>
+      </w:r>
+    </w:p>
+    <w:p/>
+    <w:p>
+      <w:r>
+        <w:t xml:space="preserve">        for (int </w:t>
+      </w:r>
+      <w:proofErr w:type="spellStart"/>
+      <w:r>
+        <w:t>i</w:t>
+      </w:r>
+      <w:proofErr w:type="spellEnd"/>
+      <w:r>
+        <w:t xml:space="preserve"> = 0; </w:t>
+      </w:r>
+      <w:proofErr w:type="spellStart"/>
+      <w:r>
+        <w:t>i</w:t>
+      </w:r>
+      <w:proofErr w:type="spellEnd"/>
+      <w:r>
+        <w:t xml:space="preserve"> &lt; </w:t>
+      </w:r>
+      <w:proofErr w:type="spellStart"/>
+      <w:proofErr w:type="gramStart"/>
+      <w:r>
+        <w:t>arr.length</w:t>
+      </w:r>
+      <w:proofErr w:type="spellEnd"/>
+      <w:proofErr w:type="gramEnd"/>
+      <w:r>
+        <w:t xml:space="preserve"> - 1; </w:t>
+      </w:r>
+      <w:proofErr w:type="spellStart"/>
+      <w:r>
+        <w:t>i</w:t>
+      </w:r>
+      <w:proofErr w:type="spellEnd"/>
+      <w:r>
+        <w:t>++) {</w:t>
+      </w:r>
+    </w:p>
+    <w:p/>
+    <w:p>
+      <w:r>
+        <w:t xml:space="preserve">            for (int j = 0; j &lt; </w:t>
+      </w:r>
+      <w:proofErr w:type="spellStart"/>
+      <w:proofErr w:type="gramStart"/>
+      <w:r>
+        <w:t>arr.length</w:t>
+      </w:r>
+      <w:proofErr w:type="spellEnd"/>
+      <w:proofErr w:type="gramEnd"/>
+      <w:r>
+        <w:t xml:space="preserve"> - </w:t>
+      </w:r>
+      <w:proofErr w:type="spellStart"/>
+      <w:r>
+        <w:t>i</w:t>
+      </w:r>
+      <w:proofErr w:type="spellEnd"/>
+      <w:r>
+        <w:t xml:space="preserve"> - 1; </w:t>
+      </w:r>
+      <w:proofErr w:type="spellStart"/>
+      <w:r>
+        <w:t>j++</w:t>
+      </w:r>
+      <w:proofErr w:type="spellEnd"/>
+      <w:r>
+        <w:t>) {</w:t>
+      </w:r>
+    </w:p>
+    <w:p/>
+    <w:p>
+      <w:r>
+        <w:t xml:space="preserve">                if (</w:t>
+      </w:r>
+      <w:proofErr w:type="spellStart"/>
+      <w:r>
+        <w:t>arr</w:t>
+      </w:r>
+      <w:proofErr w:type="spellEnd"/>
+      <w:r>
+        <w:t xml:space="preserve">[j] &gt; </w:t>
+      </w:r>
+      <w:proofErr w:type="spellStart"/>
+      <w:proofErr w:type="gramStart"/>
+      <w:r>
+        <w:t>arr</w:t>
+      </w:r>
+      <w:proofErr w:type="spellEnd"/>
+      <w:r>
+        <w:t>[</w:t>
+      </w:r>
+      <w:proofErr w:type="gramEnd"/>
+      <w:r>
+        <w:t>j + 1]) {</w:t>
+      </w:r>
+    </w:p>
+    <w:p/>
+    <w:p>
+      <w:r>
+        <w:t xml:space="preserve">                    int temp = </w:t>
+      </w:r>
+      <w:proofErr w:type="spellStart"/>
+      <w:r>
+        <w:t>arr</w:t>
+      </w:r>
+      <w:proofErr w:type="spellEnd"/>
+      <w:r>
+        <w:t>[j];</w:t>
+      </w:r>
+    </w:p>
+    <w:p>
+      <w:r>
+        <w:t xml:space="preserve">                    </w:t>
+      </w:r>
+      <w:proofErr w:type="spellStart"/>
+      <w:r>
+        <w:t>arr</w:t>
+      </w:r>
+      <w:proofErr w:type="spellEnd"/>
+      <w:r>
+        <w:t xml:space="preserve">[j] = </w:t>
+      </w:r>
+      <w:proofErr w:type="spellStart"/>
+      <w:proofErr w:type="gramStart"/>
+      <w:r>
+        <w:t>arr</w:t>
+      </w:r>
+      <w:proofErr w:type="spellEnd"/>
+      <w:r>
+        <w:t>[</w:t>
+      </w:r>
+      <w:proofErr w:type="gramEnd"/>
+      <w:r>
+        <w:t>j + 1];</w:t>
+      </w:r>
+    </w:p>
+    <w:p>
+      <w:r>
+        <w:t xml:space="preserve">                    </w:t>
+      </w:r>
+      <w:proofErr w:type="spellStart"/>
+      <w:proofErr w:type="gramStart"/>
+      <w:r>
+        <w:t>arr</w:t>
+      </w:r>
+      <w:proofErr w:type="spellEnd"/>
+      <w:r>
+        <w:t>[</w:t>
+      </w:r>
+      <w:proofErr w:type="gramEnd"/>
+      <w:r>
+        <w:t>j + 1] = temp;</w:t>
       </w:r>
     </w:p>
     <w:p>
@@ -3808,18 +4878,63 @@
     <w:p/>
     <w:p>
       <w:r>
-        <w:t xml:space="preserve">        System.out.println("Sorted array:");</w:t>
-      </w:r>
-    </w:p>
-    <w:p/>
-    <w:p>
-      <w:r>
-        <w:t xml:space="preserve">        for (int num : arr) {</w:t>
-      </w:r>
-    </w:p>
-    <w:p>
-      <w:r>
-        <w:t xml:space="preserve">            System.out.print(num + " ");</w:t>
+        <w:t xml:space="preserve">        </w:t>
+      </w:r>
+      <w:proofErr w:type="spellStart"/>
+      <w:r>
+        <w:t>System.out.println</w:t>
+      </w:r>
+      <w:proofErr w:type="spellEnd"/>
+      <w:r>
+        <w:t>("Sorted array:");</w:t>
+      </w:r>
+    </w:p>
+    <w:p/>
+    <w:p>
+      <w:r>
+        <w:t xml:space="preserve">        for (int </w:t>
+      </w:r>
+      <w:proofErr w:type="spellStart"/>
+      <w:proofErr w:type="gramStart"/>
+      <w:r>
+        <w:t>num</w:t>
+      </w:r>
+      <w:proofErr w:type="spellEnd"/>
+      <w:r>
+        <w:t xml:space="preserve"> :</w:t>
+      </w:r>
+      <w:proofErr w:type="gramEnd"/>
+      <w:r>
+        <w:t xml:space="preserve"> </w:t>
+      </w:r>
+      <w:proofErr w:type="spellStart"/>
+      <w:r>
+        <w:t>arr</w:t>
+      </w:r>
+      <w:proofErr w:type="spellEnd"/>
+      <w:r>
+        <w:t>) {</w:t>
+      </w:r>
+    </w:p>
+    <w:p>
+      <w:r>
+        <w:t xml:space="preserve">            </w:t>
+      </w:r>
+      <w:proofErr w:type="spellStart"/>
+      <w:r>
+        <w:t>System.out.print</w:t>
+      </w:r>
+      <w:proofErr w:type="spellEnd"/>
+      <w:r>
+        <w:t>(</w:t>
+      </w:r>
+      <w:proofErr w:type="spellStart"/>
+      <w:r>
+        <w:t>num</w:t>
+      </w:r>
+      <w:proofErr w:type="spellEnd"/>
+      <w:r>
+        <w:t xml:space="preserve"> + " ");</w:t>
       </w:r>
     </w:p>
     <w:p>
@@ -3934,43 +5049,167 @@
     </w:p>
     <w:p>
       <w:r>
-        <w:t>public class SelectionSort {</w:t>
-      </w:r>
-    </w:p>
-    <w:p/>
-    <w:p>
-      <w:r>
-        <w:t xml:space="preserve">    public static void main(String[] args) {</w:t>
-      </w:r>
-    </w:p>
-    <w:p/>
-    <w:p>
-      <w:r>
-        <w:t xml:space="preserve">        int[] arr = {5, 3, 8, 1, 2};</w:t>
-      </w:r>
-    </w:p>
-    <w:p/>
-    <w:p>
-      <w:r>
-        <w:t xml:space="preserve">        for (int i = 0; i &lt; arr.length - 1; i++) {</w:t>
-      </w:r>
-    </w:p>
-    <w:p/>
-    <w:p>
-      <w:r>
-        <w:t xml:space="preserve">            int min = i;</w:t>
-      </w:r>
-    </w:p>
-    <w:p/>
-    <w:p>
-      <w:r>
-        <w:t xml:space="preserve">            for (int j = i + 1; j &lt; arr.length; j++) {</w:t>
-      </w:r>
-    </w:p>
-    <w:p/>
-    <w:p>
-      <w:r>
-        <w:t xml:space="preserve">                if (arr[j] &lt; arr[min]) {</w:t>
+        <w:t xml:space="preserve">public class </w:t>
+      </w:r>
+      <w:proofErr w:type="spellStart"/>
+      <w:r>
+        <w:t>SelectionSort</w:t>
+      </w:r>
+      <w:proofErr w:type="spellEnd"/>
+      <w:r>
+        <w:t xml:space="preserve"> {</w:t>
+      </w:r>
+    </w:p>
+    <w:p/>
+    <w:p>
+      <w:r>
+        <w:t xml:space="preserve">    public static void </w:t>
+      </w:r>
+      <w:proofErr w:type="gramStart"/>
+      <w:r>
+        <w:t>main(String[</w:t>
+      </w:r>
+      <w:proofErr w:type="gramEnd"/>
+      <w:r>
+        <w:t xml:space="preserve">] </w:t>
+      </w:r>
+      <w:proofErr w:type="spellStart"/>
+      <w:r>
+        <w:t>args</w:t>
+      </w:r>
+      <w:proofErr w:type="spellEnd"/>
+      <w:r>
+        <w:t>) {</w:t>
+      </w:r>
+    </w:p>
+    <w:p/>
+    <w:p>
+      <w:r>
+        <w:t xml:space="preserve">        </w:t>
+      </w:r>
+      <w:proofErr w:type="gramStart"/>
+      <w:r>
+        <w:t>int[</w:t>
+      </w:r>
+      <w:proofErr w:type="gramEnd"/>
+      <w:r>
+        <w:t xml:space="preserve">] </w:t>
+      </w:r>
+      <w:proofErr w:type="spellStart"/>
+      <w:r>
+        <w:t>arr</w:t>
+      </w:r>
+      <w:proofErr w:type="spellEnd"/>
+      <w:r>
+        <w:t xml:space="preserve"> = {5, 3, 8, 1, 2};</w:t>
+      </w:r>
+    </w:p>
+    <w:p/>
+    <w:p>
+      <w:r>
+        <w:t xml:space="preserve">        for (int </w:t>
+      </w:r>
+      <w:proofErr w:type="spellStart"/>
+      <w:r>
+        <w:t>i</w:t>
+      </w:r>
+      <w:proofErr w:type="spellEnd"/>
+      <w:r>
+        <w:t xml:space="preserve"> = 0; </w:t>
+      </w:r>
+      <w:proofErr w:type="spellStart"/>
+      <w:r>
+        <w:t>i</w:t>
+      </w:r>
+      <w:proofErr w:type="spellEnd"/>
+      <w:r>
+        <w:t xml:space="preserve"> &lt; </w:t>
+      </w:r>
+      <w:proofErr w:type="spellStart"/>
+      <w:proofErr w:type="gramStart"/>
+      <w:r>
+        <w:t>arr.length</w:t>
+      </w:r>
+      <w:proofErr w:type="spellEnd"/>
+      <w:proofErr w:type="gramEnd"/>
+      <w:r>
+        <w:t xml:space="preserve"> - 1; </w:t>
+      </w:r>
+      <w:proofErr w:type="spellStart"/>
+      <w:r>
+        <w:t>i</w:t>
+      </w:r>
+      <w:proofErr w:type="spellEnd"/>
+      <w:r>
+        <w:t>++) {</w:t>
+      </w:r>
+    </w:p>
+    <w:p/>
+    <w:p>
+      <w:r>
+        <w:t xml:space="preserve">            int min = </w:t>
+      </w:r>
+      <w:proofErr w:type="spellStart"/>
+      <w:r>
+        <w:t>i</w:t>
+      </w:r>
+      <w:proofErr w:type="spellEnd"/>
+      <w:r>
+        <w:t>;</w:t>
+      </w:r>
+    </w:p>
+    <w:p/>
+    <w:p>
+      <w:r>
+        <w:t xml:space="preserve">            for (int j = </w:t>
+      </w:r>
+      <w:proofErr w:type="spellStart"/>
+      <w:r>
+        <w:t>i</w:t>
+      </w:r>
+      <w:proofErr w:type="spellEnd"/>
+      <w:r>
+        <w:t xml:space="preserve"> + 1; j &lt; </w:t>
+      </w:r>
+      <w:proofErr w:type="spellStart"/>
+      <w:proofErr w:type="gramStart"/>
+      <w:r>
+        <w:t>arr.length</w:t>
+      </w:r>
+      <w:proofErr w:type="spellEnd"/>
+      <w:proofErr w:type="gramEnd"/>
+      <w:r>
+        <w:t xml:space="preserve">; </w:t>
+      </w:r>
+      <w:proofErr w:type="spellStart"/>
+      <w:r>
+        <w:t>j++</w:t>
+      </w:r>
+      <w:proofErr w:type="spellEnd"/>
+      <w:r>
+        <w:t>) {</w:t>
+      </w:r>
+    </w:p>
+    <w:p/>
+    <w:p>
+      <w:r>
+        <w:t xml:space="preserve">                if (</w:t>
+      </w:r>
+      <w:proofErr w:type="spellStart"/>
+      <w:r>
+        <w:t>arr</w:t>
+      </w:r>
+      <w:proofErr w:type="spellEnd"/>
+      <w:r>
+        <w:t xml:space="preserve">[j] &lt; </w:t>
+      </w:r>
+      <w:proofErr w:type="spellStart"/>
+      <w:r>
+        <w:t>arr</w:t>
+      </w:r>
+      <w:proofErr w:type="spellEnd"/>
+      <w:r>
+        <w:t>[min]) {</w:t>
       </w:r>
     </w:p>
     <w:p>
@@ -3991,18 +5230,66 @@
     <w:p/>
     <w:p>
       <w:r>
-        <w:t xml:space="preserve">            int temp = arr[i];</w:t>
+        <w:t xml:space="preserve">            int temp = </w:t>
+      </w:r>
+      <w:proofErr w:type="spellStart"/>
+      <w:r>
+        <w:t>arr</w:t>
+      </w:r>
+      <w:proofErr w:type="spellEnd"/>
+      <w:r>
+        <w:t>[</w:t>
+      </w:r>
+      <w:proofErr w:type="spellStart"/>
+      <w:r>
+        <w:t>i</w:t>
+      </w:r>
+      <w:proofErr w:type="spellEnd"/>
+      <w:r>
+        <w:t>];</w:t>
       </w:r>
     </w:p>
     <w:p>
       <w:r>
         <w:lastRenderedPageBreak/>
-        <w:t xml:space="preserve">            arr[i] = arr[min];</w:t>
-      </w:r>
-    </w:p>
-    <w:p>
-      <w:r>
-        <w:t xml:space="preserve">            arr[min] = temp;</w:t>
+        <w:t xml:space="preserve">            </w:t>
+      </w:r>
+      <w:proofErr w:type="spellStart"/>
+      <w:r>
+        <w:t>arr</w:t>
+      </w:r>
+      <w:proofErr w:type="spellEnd"/>
+      <w:r>
+        <w:t>[</w:t>
+      </w:r>
+      <w:proofErr w:type="spellStart"/>
+      <w:r>
+        <w:t>i</w:t>
+      </w:r>
+      <w:proofErr w:type="spellEnd"/>
+      <w:r>
+        <w:t xml:space="preserve">] = </w:t>
+      </w:r>
+      <w:proofErr w:type="spellStart"/>
+      <w:r>
+        <w:t>arr</w:t>
+      </w:r>
+      <w:proofErr w:type="spellEnd"/>
+      <w:r>
+        <w:t>[min];</w:t>
+      </w:r>
+    </w:p>
+    <w:p>
+      <w:r>
+        <w:t xml:space="preserve">            </w:t>
+      </w:r>
+      <w:proofErr w:type="spellStart"/>
+      <w:r>
+        <w:t>arr</w:t>
+      </w:r>
+      <w:proofErr w:type="spellEnd"/>
+      <w:r>
+        <w:t>[min] = temp;</w:t>
       </w:r>
     </w:p>
     <w:p>
@@ -4013,18 +5300,63 @@
     <w:p/>
     <w:p>
       <w:r>
-        <w:t xml:space="preserve">        System.out.println("Sorted array:");</w:t>
-      </w:r>
-    </w:p>
-    <w:p/>
-    <w:p>
-      <w:r>
-        <w:t xml:space="preserve">        for (int num : arr) {</w:t>
-      </w:r>
-    </w:p>
-    <w:p>
-      <w:r>
-        <w:t xml:space="preserve">            System.out.print(num + " ");</w:t>
+        <w:t xml:space="preserve">        </w:t>
+      </w:r>
+      <w:proofErr w:type="spellStart"/>
+      <w:r>
+        <w:t>System.out.println</w:t>
+      </w:r>
+      <w:proofErr w:type="spellEnd"/>
+      <w:r>
+        <w:t>("Sorted array:");</w:t>
+      </w:r>
+    </w:p>
+    <w:p/>
+    <w:p>
+      <w:r>
+        <w:t xml:space="preserve">        for (int </w:t>
+      </w:r>
+      <w:proofErr w:type="spellStart"/>
+      <w:proofErr w:type="gramStart"/>
+      <w:r>
+        <w:t>num</w:t>
+      </w:r>
+      <w:proofErr w:type="spellEnd"/>
+      <w:r>
+        <w:t xml:space="preserve"> :</w:t>
+      </w:r>
+      <w:proofErr w:type="gramEnd"/>
+      <w:r>
+        <w:t xml:space="preserve"> </w:t>
+      </w:r>
+      <w:proofErr w:type="spellStart"/>
+      <w:r>
+        <w:t>arr</w:t>
+      </w:r>
+      <w:proofErr w:type="spellEnd"/>
+      <w:r>
+        <w:t>) {</w:t>
+      </w:r>
+    </w:p>
+    <w:p>
+      <w:r>
+        <w:t xml:space="preserve">            </w:t>
+      </w:r>
+      <w:proofErr w:type="spellStart"/>
+      <w:r>
+        <w:t>System.out.print</w:t>
+      </w:r>
+      <w:proofErr w:type="spellEnd"/>
+      <w:r>
+        <w:t>(</w:t>
+      </w:r>
+      <w:proofErr w:type="spellStart"/>
+      <w:r>
+        <w:t>num</w:t>
+      </w:r>
+      <w:proofErr w:type="spellEnd"/>
+      <w:r>
+        <w:t xml:space="preserve"> + " ");</w:t>
       </w:r>
     </w:p>
     <w:p>
@@ -4153,19 +5485,59 @@
     </w:p>
     <w:p>
       <w:r>
-        <w:t>public class LinearSearch {</w:t>
-      </w:r>
-    </w:p>
-    <w:p/>
-    <w:p>
-      <w:r>
-        <w:t xml:space="preserve">    public static void main(String[] args) {</w:t>
-      </w:r>
-    </w:p>
-    <w:p/>
-    <w:p>
-      <w:r>
-        <w:t xml:space="preserve">        int[] arr = {10, 20, 30, 40, 50};</w:t>
+        <w:t xml:space="preserve">public class </w:t>
+      </w:r>
+      <w:proofErr w:type="spellStart"/>
+      <w:r>
+        <w:t>LinearSearch</w:t>
+      </w:r>
+      <w:proofErr w:type="spellEnd"/>
+      <w:r>
+        <w:t xml:space="preserve"> {</w:t>
+      </w:r>
+    </w:p>
+    <w:p/>
+    <w:p>
+      <w:r>
+        <w:t xml:space="preserve">    public static void </w:t>
+      </w:r>
+      <w:proofErr w:type="gramStart"/>
+      <w:r>
+        <w:t>main(String[</w:t>
+      </w:r>
+      <w:proofErr w:type="gramEnd"/>
+      <w:r>
+        <w:t xml:space="preserve">] </w:t>
+      </w:r>
+      <w:proofErr w:type="spellStart"/>
+      <w:r>
+        <w:t>args</w:t>
+      </w:r>
+      <w:proofErr w:type="spellEnd"/>
+      <w:r>
+        <w:t>) {</w:t>
+      </w:r>
+    </w:p>
+    <w:p/>
+    <w:p>
+      <w:r>
+        <w:t xml:space="preserve">        </w:t>
+      </w:r>
+      <w:proofErr w:type="gramStart"/>
+      <w:r>
+        <w:t>int[</w:t>
+      </w:r>
+      <w:proofErr w:type="gramEnd"/>
+      <w:r>
+        <w:t xml:space="preserve">] </w:t>
+      </w:r>
+      <w:proofErr w:type="spellStart"/>
+      <w:r>
+        <w:t>arr</w:t>
+      </w:r>
+      <w:proofErr w:type="spellEnd"/>
+      <w:r>
+        <w:t xml:space="preserve"> = {10, 20, 30, 40, 50};</w:t>
       </w:r>
     </w:p>
     <w:p/>
@@ -4183,18 +5555,76 @@
     <w:p/>
     <w:p>
       <w:r>
-        <w:t xml:space="preserve">        for (int i = 0; i &lt; arr.length; i++) {</w:t>
-      </w:r>
-    </w:p>
-    <w:p/>
-    <w:p>
-      <w:r>
-        <w:t xml:space="preserve">            if (arr[i] == key) {</w:t>
-      </w:r>
-    </w:p>
-    <w:p>
-      <w:r>
-        <w:t xml:space="preserve">                position = i;</w:t>
+        <w:t xml:space="preserve">        for (int </w:t>
+      </w:r>
+      <w:proofErr w:type="spellStart"/>
+      <w:r>
+        <w:t>i</w:t>
+      </w:r>
+      <w:proofErr w:type="spellEnd"/>
+      <w:r>
+        <w:t xml:space="preserve"> = 0; </w:t>
+      </w:r>
+      <w:proofErr w:type="spellStart"/>
+      <w:r>
+        <w:t>i</w:t>
+      </w:r>
+      <w:proofErr w:type="spellEnd"/>
+      <w:r>
+        <w:t xml:space="preserve"> &lt; </w:t>
+      </w:r>
+      <w:proofErr w:type="spellStart"/>
+      <w:proofErr w:type="gramStart"/>
+      <w:r>
+        <w:t>arr.length</w:t>
+      </w:r>
+      <w:proofErr w:type="spellEnd"/>
+      <w:proofErr w:type="gramEnd"/>
+      <w:r>
+        <w:t xml:space="preserve">; </w:t>
+      </w:r>
+      <w:proofErr w:type="spellStart"/>
+      <w:r>
+        <w:t>i</w:t>
+      </w:r>
+      <w:proofErr w:type="spellEnd"/>
+      <w:r>
+        <w:t>++) {</w:t>
+      </w:r>
+    </w:p>
+    <w:p/>
+    <w:p>
+      <w:r>
+        <w:t xml:space="preserve">            if (</w:t>
+      </w:r>
+      <w:proofErr w:type="spellStart"/>
+      <w:r>
+        <w:t>arr</w:t>
+      </w:r>
+      <w:proofErr w:type="spellEnd"/>
+      <w:r>
+        <w:t>[</w:t>
+      </w:r>
+      <w:proofErr w:type="spellStart"/>
+      <w:r>
+        <w:t>i</w:t>
+      </w:r>
+      <w:proofErr w:type="spellEnd"/>
+      <w:r>
+        <w:t>] == key) {</w:t>
+      </w:r>
+    </w:p>
+    <w:p>
+      <w:r>
+        <w:t xml:space="preserve">                position = </w:t>
+      </w:r>
+      <w:proofErr w:type="spellStart"/>
+      <w:r>
+        <w:t>i</w:t>
+      </w:r>
+      <w:proofErr w:type="spellEnd"/>
+      <w:r>
+        <w:t>;</w:t>
       </w:r>
     </w:p>
     <w:p>
@@ -4215,12 +5645,28 @@
     <w:p/>
     <w:p>
       <w:r>
-        <w:t xml:space="preserve">        if (position != -1) {</w:t>
-      </w:r>
-    </w:p>
-    <w:p>
-      <w:r>
-        <w:t xml:space="preserve">            System.out.println("Element found at index: " + position);</w:t>
+        <w:t xml:space="preserve">        if (</w:t>
+      </w:r>
+      <w:proofErr w:type="gramStart"/>
+      <w:r>
+        <w:t>position !</w:t>
+      </w:r>
+      <w:proofErr w:type="gramEnd"/>
+      <w:r>
+        <w:t>= -1) {</w:t>
+      </w:r>
+    </w:p>
+    <w:p>
+      <w:r>
+        <w:t xml:space="preserve">            </w:t>
+      </w:r>
+      <w:proofErr w:type="spellStart"/>
+      <w:r>
+        <w:t>System.out.println</w:t>
+      </w:r>
+      <w:proofErr w:type="spellEnd"/>
+      <w:r>
+        <w:t>("Element found at index: " + position);</w:t>
       </w:r>
     </w:p>
     <w:p>
@@ -4230,7 +5676,15 @@
     </w:p>
     <w:p>
       <w:r>
-        <w:t xml:space="preserve">            System.out.println("Element not found");</w:t>
+        <w:t xml:space="preserve">            </w:t>
+      </w:r>
+      <w:proofErr w:type="spellStart"/>
+      <w:r>
+        <w:t>System.out.println</w:t>
+      </w:r>
+      <w:proofErr w:type="spellEnd"/>
+      <w:r>
+        <w:t>("Element not found");</w:t>
       </w:r>
     </w:p>
     <w:p>
@@ -4288,6 +5742,2261 @@
         <w:t>O(n)</w:t>
       </w:r>
     </w:p>
+    <w:p/>
+    <w:p/>
+    <w:p/>
+    <w:p/>
+    <w:p/>
+    <w:p>
+      <w:r>
+        <w:br/>
+      </w:r>
+      <w:r>
+        <w:br/>
+      </w:r>
+      <w:r>
+        <w:lastRenderedPageBreak/>
+        <w:br/>
+      </w:r>
+      <w:r>
+        <w:rPr>
+          <w:b/>
+          <w:bCs/>
+        </w:rPr>
+        <w:t>Home Tasks – Sorting and Searching Algorithms</w:t>
+      </w:r>
+    </w:p>
+    <w:p>
+      <w:pPr>
+        <w:rPr>
+          <w:b/>
+          <w:bCs/>
+        </w:rPr>
+      </w:pPr>
+      <w:r>
+        <w:rPr>
+          <w:b/>
+          <w:bCs/>
+        </w:rPr>
+        <w:t>1. Insertion Sort</w:t>
+      </w:r>
+    </w:p>
+    <w:p>
+      <w:r>
+        <w:rPr>
+          <w:b/>
+          <w:bCs/>
+        </w:rPr>
+        <w:t>Concept:</w:t>
+      </w:r>
+      <w:r>
+        <w:t xml:space="preserve"> Insertion Sort builds the sorted array one element at a time. It is useful when the data is already almost sorted.</w:t>
+      </w:r>
+    </w:p>
+    <w:p>
+      <w:r>
+        <w:rPr>
+          <w:b/>
+          <w:bCs/>
+        </w:rPr>
+        <w:t>Time Complexity:</w:t>
+      </w:r>
+      <w:r>
+        <w:t xml:space="preserve"> O(n²)</w:t>
+      </w:r>
+    </w:p>
+    <w:p>
+      <w:pPr>
+        <w:rPr>
+          <w:b/>
+          <w:bCs/>
+        </w:rPr>
+      </w:pPr>
+      <w:r>
+        <w:rPr>
+          <w:b/>
+          <w:bCs/>
+        </w:rPr>
+        <w:t>Java Code:</w:t>
+      </w:r>
+    </w:p>
+    <w:p>
+      <w:r>
+        <w:t xml:space="preserve">public class </w:t>
+      </w:r>
+      <w:proofErr w:type="spellStart"/>
+      <w:r>
+        <w:t>InsertionSort</w:t>
+      </w:r>
+      <w:proofErr w:type="spellEnd"/>
+      <w:r>
+        <w:t xml:space="preserve"> {</w:t>
+      </w:r>
+    </w:p>
+    <w:p/>
+    <w:p>
+      <w:r>
+        <w:t xml:space="preserve">    public static void </w:t>
+      </w:r>
+      <w:proofErr w:type="gramStart"/>
+      <w:r>
+        <w:t>main(String[</w:t>
+      </w:r>
+      <w:proofErr w:type="gramEnd"/>
+      <w:r>
+        <w:t xml:space="preserve">] </w:t>
+      </w:r>
+      <w:proofErr w:type="spellStart"/>
+      <w:r>
+        <w:t>args</w:t>
+      </w:r>
+      <w:proofErr w:type="spellEnd"/>
+      <w:r>
+        <w:t>) {</w:t>
+      </w:r>
+    </w:p>
+    <w:p/>
+    <w:p>
+      <w:r>
+        <w:t xml:space="preserve">        </w:t>
+      </w:r>
+      <w:proofErr w:type="gramStart"/>
+      <w:r>
+        <w:t>int[</w:t>
+      </w:r>
+      <w:proofErr w:type="gramEnd"/>
+      <w:r>
+        <w:t xml:space="preserve">] </w:t>
+      </w:r>
+      <w:proofErr w:type="spellStart"/>
+      <w:r>
+        <w:t>arr</w:t>
+      </w:r>
+      <w:proofErr w:type="spellEnd"/>
+      <w:r>
+        <w:t xml:space="preserve"> = {5, 3, 8, 1, 2};</w:t>
+      </w:r>
+    </w:p>
+    <w:p/>
+    <w:p>
+      <w:r>
+        <w:t xml:space="preserve">        for (int </w:t>
+      </w:r>
+      <w:proofErr w:type="spellStart"/>
+      <w:r>
+        <w:t>i</w:t>
+      </w:r>
+      <w:proofErr w:type="spellEnd"/>
+      <w:r>
+        <w:t xml:space="preserve"> = 1; </w:t>
+      </w:r>
+      <w:proofErr w:type="spellStart"/>
+      <w:r>
+        <w:t>i</w:t>
+      </w:r>
+      <w:proofErr w:type="spellEnd"/>
+      <w:r>
+        <w:t xml:space="preserve"> &lt; </w:t>
+      </w:r>
+      <w:proofErr w:type="spellStart"/>
+      <w:proofErr w:type="gramStart"/>
+      <w:r>
+        <w:t>arr.length</w:t>
+      </w:r>
+      <w:proofErr w:type="spellEnd"/>
+      <w:proofErr w:type="gramEnd"/>
+      <w:r>
+        <w:t xml:space="preserve">; </w:t>
+      </w:r>
+      <w:proofErr w:type="spellStart"/>
+      <w:r>
+        <w:t>i</w:t>
+      </w:r>
+      <w:proofErr w:type="spellEnd"/>
+      <w:r>
+        <w:t>++) {</w:t>
+      </w:r>
+    </w:p>
+    <w:p/>
+    <w:p>
+      <w:r>
+        <w:t xml:space="preserve">            int key = </w:t>
+      </w:r>
+      <w:proofErr w:type="spellStart"/>
+      <w:r>
+        <w:t>arr</w:t>
+      </w:r>
+      <w:proofErr w:type="spellEnd"/>
+      <w:r>
+        <w:t>[</w:t>
+      </w:r>
+      <w:proofErr w:type="spellStart"/>
+      <w:r>
+        <w:t>i</w:t>
+      </w:r>
+      <w:proofErr w:type="spellEnd"/>
+      <w:r>
+        <w:t>];</w:t>
+      </w:r>
+    </w:p>
+    <w:p>
+      <w:r>
+        <w:t xml:space="preserve">            int j = </w:t>
+      </w:r>
+      <w:proofErr w:type="spellStart"/>
+      <w:r>
+        <w:t>i</w:t>
+      </w:r>
+      <w:proofErr w:type="spellEnd"/>
+      <w:r>
+        <w:t xml:space="preserve"> - 1;</w:t>
+      </w:r>
+    </w:p>
+    <w:p/>
+    <w:p>
+      <w:r>
+        <w:t xml:space="preserve">            while (j &gt;= 0 &amp;&amp; </w:t>
+      </w:r>
+      <w:proofErr w:type="spellStart"/>
+      <w:r>
+        <w:t>arr</w:t>
+      </w:r>
+      <w:proofErr w:type="spellEnd"/>
+      <w:r>
+        <w:t>[j] &gt; key) {</w:t>
+      </w:r>
+    </w:p>
+    <w:p>
+      <w:r>
+        <w:t xml:space="preserve">                </w:t>
+      </w:r>
+      <w:proofErr w:type="spellStart"/>
+      <w:proofErr w:type="gramStart"/>
+      <w:r>
+        <w:t>arr</w:t>
+      </w:r>
+      <w:proofErr w:type="spellEnd"/>
+      <w:r>
+        <w:t>[</w:t>
+      </w:r>
+      <w:proofErr w:type="gramEnd"/>
+      <w:r>
+        <w:t xml:space="preserve">j + 1] = </w:t>
+      </w:r>
+      <w:proofErr w:type="spellStart"/>
+      <w:r>
+        <w:t>arr</w:t>
+      </w:r>
+      <w:proofErr w:type="spellEnd"/>
+      <w:r>
+        <w:t>[j];</w:t>
+      </w:r>
+    </w:p>
+    <w:p>
+      <w:r>
+        <w:t xml:space="preserve">                j--;</w:t>
+      </w:r>
+    </w:p>
+    <w:p>
+      <w:r>
+        <w:t xml:space="preserve">            }</w:t>
+      </w:r>
+    </w:p>
+    <w:p/>
+    <w:p>
+      <w:r>
+        <w:t xml:space="preserve">            </w:t>
+      </w:r>
+      <w:proofErr w:type="spellStart"/>
+      <w:proofErr w:type="gramStart"/>
+      <w:r>
+        <w:t>arr</w:t>
+      </w:r>
+      <w:proofErr w:type="spellEnd"/>
+      <w:r>
+        <w:t>[</w:t>
+      </w:r>
+      <w:proofErr w:type="gramEnd"/>
+      <w:r>
+        <w:t>j + 1] = key;</w:t>
+      </w:r>
+    </w:p>
+    <w:p>
+      <w:r>
+        <w:t xml:space="preserve">        }</w:t>
+      </w:r>
+    </w:p>
+    <w:p/>
+    <w:p>
+      <w:r>
+        <w:t xml:space="preserve">        </w:t>
+      </w:r>
+      <w:proofErr w:type="spellStart"/>
+      <w:r>
+        <w:t>System.out.println</w:t>
+      </w:r>
+      <w:proofErr w:type="spellEnd"/>
+      <w:r>
+        <w:t>("Sorted array:");</w:t>
+      </w:r>
+    </w:p>
+    <w:p/>
+    <w:p>
+      <w:r>
+        <w:t xml:space="preserve">        for (int </w:t>
+      </w:r>
+      <w:proofErr w:type="spellStart"/>
+      <w:proofErr w:type="gramStart"/>
+      <w:r>
+        <w:t>num</w:t>
+      </w:r>
+      <w:proofErr w:type="spellEnd"/>
+      <w:r>
+        <w:t xml:space="preserve"> :</w:t>
+      </w:r>
+      <w:proofErr w:type="gramEnd"/>
+      <w:r>
+        <w:t xml:space="preserve"> </w:t>
+      </w:r>
+      <w:proofErr w:type="spellStart"/>
+      <w:r>
+        <w:t>arr</w:t>
+      </w:r>
+      <w:proofErr w:type="spellEnd"/>
+      <w:r>
+        <w:t>) {</w:t>
+      </w:r>
+    </w:p>
+    <w:p>
+      <w:r>
+        <w:lastRenderedPageBreak/>
+        <w:t xml:space="preserve">            </w:t>
+      </w:r>
+      <w:proofErr w:type="spellStart"/>
+      <w:r>
+        <w:t>System.out.print</w:t>
+      </w:r>
+      <w:proofErr w:type="spellEnd"/>
+      <w:r>
+        <w:t>(</w:t>
+      </w:r>
+      <w:proofErr w:type="spellStart"/>
+      <w:r>
+        <w:t>num</w:t>
+      </w:r>
+      <w:proofErr w:type="spellEnd"/>
+      <w:r>
+        <w:t xml:space="preserve"> + " ");</w:t>
+      </w:r>
+    </w:p>
+    <w:p>
+      <w:r>
+        <w:t xml:space="preserve">        }</w:t>
+      </w:r>
+    </w:p>
+    <w:p>
+      <w:r>
+        <w:t xml:space="preserve">    }</w:t>
+      </w:r>
+    </w:p>
+    <w:p>
+      <w:r>
+        <w:t>}</w:t>
+      </w:r>
+    </w:p>
+    <w:p>
+      <w:pPr>
+        <w:rPr>
+          <w:b/>
+          <w:bCs/>
+        </w:rPr>
+      </w:pPr>
+      <w:r>
+        <w:rPr>
+          <w:b/>
+          <w:bCs/>
+        </w:rPr>
+        <w:t>Output:</w:t>
+      </w:r>
+    </w:p>
+    <w:p>
+      <w:r>
+        <w:t>Sorted array:</w:t>
+      </w:r>
+    </w:p>
+    <w:p>
+      <w:r>
+        <w:t>1 2 3 5 8</w:t>
+      </w:r>
+    </w:p>
+    <w:p>
+      <w:r>
+        <w:pict w14:anchorId="4B37DEC5">
+          <v:rect id="_x0000_i1058" style="width:0;height:1.5pt" o:hralign="center" o:hrstd="t" o:hr="t" fillcolor="#a0a0a0" stroked="f"/>
+        </w:pict>
+      </w:r>
+    </w:p>
+    <w:p>
+      <w:pPr>
+        <w:rPr>
+          <w:b/>
+          <w:bCs/>
+        </w:rPr>
+      </w:pPr>
+      <w:r>
+        <w:rPr>
+          <w:b/>
+          <w:bCs/>
+        </w:rPr>
+        <w:t>2. Merge Sort</w:t>
+      </w:r>
+    </w:p>
+    <w:p>
+      <w:r>
+        <w:rPr>
+          <w:b/>
+          <w:bCs/>
+        </w:rPr>
+        <w:t>Concept:</w:t>
+      </w:r>
+      <w:r>
+        <w:t xml:space="preserve"> Merge Sort divides the array into smaller parts, sorts them, and then combines them back together.</w:t>
+      </w:r>
+    </w:p>
+    <w:p>
+      <w:r>
+        <w:rPr>
+          <w:b/>
+          <w:bCs/>
+        </w:rPr>
+        <w:t>Time Complexity:</w:t>
+      </w:r>
+      <w:r>
+        <w:t xml:space="preserve"> </w:t>
+      </w:r>
+      <w:proofErr w:type="gramStart"/>
+      <w:r>
+        <w:t>O(</w:t>
+      </w:r>
+      <w:proofErr w:type="gramEnd"/>
+      <w:r>
+        <w:t>n log n)</w:t>
+      </w:r>
+    </w:p>
+    <w:p>
+      <w:pPr>
+        <w:rPr>
+          <w:b/>
+          <w:bCs/>
+        </w:rPr>
+      </w:pPr>
+      <w:r>
+        <w:rPr>
+          <w:b/>
+          <w:bCs/>
+        </w:rPr>
+        <w:t>Java Code:</w:t>
+      </w:r>
+    </w:p>
+    <w:p>
+      <w:r>
+        <w:t xml:space="preserve">public class </w:t>
+      </w:r>
+      <w:proofErr w:type="spellStart"/>
+      <w:r>
+        <w:t>MergeSort</w:t>
+      </w:r>
+      <w:proofErr w:type="spellEnd"/>
+      <w:r>
+        <w:t xml:space="preserve"> {</w:t>
+      </w:r>
+    </w:p>
+    <w:p/>
+    <w:p>
+      <w:r>
+        <w:t xml:space="preserve">    static void merge(</w:t>
+      </w:r>
+      <w:proofErr w:type="gramStart"/>
+      <w:r>
+        <w:t>int[</w:t>
+      </w:r>
+      <w:proofErr w:type="gramEnd"/>
+      <w:r>
+        <w:t xml:space="preserve">] </w:t>
+      </w:r>
+      <w:proofErr w:type="spellStart"/>
+      <w:r>
+        <w:t>arr</w:t>
+      </w:r>
+      <w:proofErr w:type="spellEnd"/>
+      <w:r>
+        <w:t>, int left, int mid, int right) {</w:t>
+      </w:r>
+    </w:p>
+    <w:p/>
+    <w:p>
+      <w:r>
+        <w:t xml:space="preserve">        int n1 = mid - left + 1;</w:t>
+      </w:r>
+    </w:p>
+    <w:p>
+      <w:r>
+        <w:t xml:space="preserve">        int n2 = right - mid;</w:t>
+      </w:r>
+    </w:p>
+    <w:p/>
+    <w:p>
+      <w:r>
+        <w:t xml:space="preserve">        </w:t>
+      </w:r>
+      <w:proofErr w:type="gramStart"/>
+      <w:r>
+        <w:t>int[</w:t>
+      </w:r>
+      <w:proofErr w:type="gramEnd"/>
+      <w:r>
+        <w:t>] L = new int[n1];</w:t>
+      </w:r>
+    </w:p>
+    <w:p>
+      <w:r>
+        <w:t xml:space="preserve">        </w:t>
+      </w:r>
+      <w:proofErr w:type="gramStart"/>
+      <w:r>
+        <w:t>int[</w:t>
+      </w:r>
+      <w:proofErr w:type="gramEnd"/>
+      <w:r>
+        <w:t>] R = new int[n2];</w:t>
+      </w:r>
+    </w:p>
+    <w:p/>
+    <w:p>
+      <w:r>
+        <w:t xml:space="preserve">        for (int </w:t>
+      </w:r>
+      <w:proofErr w:type="spellStart"/>
+      <w:r>
+        <w:t>i</w:t>
+      </w:r>
+      <w:proofErr w:type="spellEnd"/>
+      <w:r>
+        <w:t xml:space="preserve"> = 0; </w:t>
+      </w:r>
+      <w:proofErr w:type="spellStart"/>
+      <w:r>
+        <w:t>i</w:t>
+      </w:r>
+      <w:proofErr w:type="spellEnd"/>
+      <w:r>
+        <w:t xml:space="preserve"> &lt; n1; </w:t>
+      </w:r>
+      <w:proofErr w:type="spellStart"/>
+      <w:r>
+        <w:t>i</w:t>
+      </w:r>
+      <w:proofErr w:type="spellEnd"/>
+      <w:r>
+        <w:t>++) {</w:t>
+      </w:r>
+    </w:p>
+    <w:p>
+      <w:r>
+        <w:t xml:space="preserve">            L[</w:t>
+      </w:r>
+      <w:proofErr w:type="spellStart"/>
+      <w:r>
+        <w:t>i</w:t>
+      </w:r>
+      <w:proofErr w:type="spellEnd"/>
+      <w:r>
+        <w:t xml:space="preserve">] = </w:t>
+      </w:r>
+      <w:proofErr w:type="spellStart"/>
+      <w:proofErr w:type="gramStart"/>
+      <w:r>
+        <w:t>arr</w:t>
+      </w:r>
+      <w:proofErr w:type="spellEnd"/>
+      <w:r>
+        <w:t>[</w:t>
+      </w:r>
+      <w:proofErr w:type="gramEnd"/>
+      <w:r>
+        <w:t xml:space="preserve">left + </w:t>
+      </w:r>
+      <w:proofErr w:type="spellStart"/>
+      <w:r>
+        <w:t>i</w:t>
+      </w:r>
+      <w:proofErr w:type="spellEnd"/>
+      <w:r>
+        <w:t>];</w:t>
+      </w:r>
+    </w:p>
+    <w:p>
+      <w:r>
+        <w:t xml:space="preserve">        }</w:t>
+      </w:r>
+    </w:p>
+    <w:p/>
+    <w:p>
+      <w:r>
+        <w:t xml:space="preserve">        for (int j = 0; j &lt; n2; </w:t>
+      </w:r>
+      <w:proofErr w:type="spellStart"/>
+      <w:r>
+        <w:t>j++</w:t>
+      </w:r>
+      <w:proofErr w:type="spellEnd"/>
+      <w:r>
+        <w:t>) {</w:t>
+      </w:r>
+    </w:p>
+    <w:p>
+      <w:r>
+        <w:lastRenderedPageBreak/>
+        <w:t xml:space="preserve">            R[j] = </w:t>
+      </w:r>
+      <w:proofErr w:type="spellStart"/>
+      <w:proofErr w:type="gramStart"/>
+      <w:r>
+        <w:t>arr</w:t>
+      </w:r>
+      <w:proofErr w:type="spellEnd"/>
+      <w:r>
+        <w:t>[</w:t>
+      </w:r>
+      <w:proofErr w:type="gramEnd"/>
+      <w:r>
+        <w:t>mid + 1 + j];</w:t>
+      </w:r>
+    </w:p>
+    <w:p>
+      <w:r>
+        <w:t xml:space="preserve">        }</w:t>
+      </w:r>
+    </w:p>
+    <w:p/>
+    <w:p>
+      <w:r>
+        <w:t xml:space="preserve">        int </w:t>
+      </w:r>
+      <w:proofErr w:type="spellStart"/>
+      <w:r>
+        <w:t>i</w:t>
+      </w:r>
+      <w:proofErr w:type="spellEnd"/>
+      <w:r>
+        <w:t xml:space="preserve"> = 0;</w:t>
+      </w:r>
+    </w:p>
+    <w:p>
+      <w:r>
+        <w:t xml:space="preserve">        int j = 0;</w:t>
+      </w:r>
+    </w:p>
+    <w:p>
+      <w:r>
+        <w:t xml:space="preserve">        int k = left;</w:t>
+      </w:r>
+    </w:p>
+    <w:p/>
+    <w:p>
+      <w:r>
+        <w:t xml:space="preserve">        while (</w:t>
+      </w:r>
+      <w:proofErr w:type="spellStart"/>
+      <w:r>
+        <w:t>i</w:t>
+      </w:r>
+      <w:proofErr w:type="spellEnd"/>
+      <w:r>
+        <w:t xml:space="preserve"> &lt; n1 &amp;&amp; j &lt; n2) {</w:t>
+      </w:r>
+    </w:p>
+    <w:p/>
+    <w:p>
+      <w:r>
+        <w:t xml:space="preserve">            if (L[</w:t>
+      </w:r>
+      <w:proofErr w:type="spellStart"/>
+      <w:r>
+        <w:t>i</w:t>
+      </w:r>
+      <w:proofErr w:type="spellEnd"/>
+      <w:r>
+        <w:t>] &lt;= R[j]) {</w:t>
+      </w:r>
+    </w:p>
+    <w:p>
+      <w:r>
+        <w:t xml:space="preserve">                </w:t>
+      </w:r>
+      <w:proofErr w:type="spellStart"/>
+      <w:r>
+        <w:t>arr</w:t>
+      </w:r>
+      <w:proofErr w:type="spellEnd"/>
+      <w:r>
+        <w:t>[k] = L[</w:t>
+      </w:r>
+      <w:proofErr w:type="spellStart"/>
+      <w:r>
+        <w:t>i</w:t>
+      </w:r>
+      <w:proofErr w:type="spellEnd"/>
+      <w:r>
+        <w:t>];</w:t>
+      </w:r>
+    </w:p>
+    <w:p>
+      <w:r>
+        <w:t xml:space="preserve">                </w:t>
+      </w:r>
+      <w:proofErr w:type="spellStart"/>
+      <w:r>
+        <w:t>i</w:t>
+      </w:r>
+      <w:proofErr w:type="spellEnd"/>
+      <w:r>
+        <w:t>++;</w:t>
+      </w:r>
+    </w:p>
+    <w:p>
+      <w:r>
+        <w:t xml:space="preserve">            } else {</w:t>
+      </w:r>
+    </w:p>
+    <w:p>
+      <w:r>
+        <w:t xml:space="preserve">                </w:t>
+      </w:r>
+      <w:proofErr w:type="spellStart"/>
+      <w:r>
+        <w:t>arr</w:t>
+      </w:r>
+      <w:proofErr w:type="spellEnd"/>
+      <w:r>
+        <w:t>[k] = R[j];</w:t>
+      </w:r>
+    </w:p>
+    <w:p>
+      <w:r>
+        <w:t xml:space="preserve">                </w:t>
+      </w:r>
+      <w:proofErr w:type="spellStart"/>
+      <w:r>
+        <w:t>j++</w:t>
+      </w:r>
+      <w:proofErr w:type="spellEnd"/>
+      <w:r>
+        <w:t>;</w:t>
+      </w:r>
+    </w:p>
+    <w:p>
+      <w:r>
+        <w:t xml:space="preserve">            }</w:t>
+      </w:r>
+    </w:p>
+    <w:p/>
+    <w:p>
+      <w:r>
+        <w:t xml:space="preserve">            k++;</w:t>
+      </w:r>
+    </w:p>
+    <w:p>
+      <w:r>
+        <w:t xml:space="preserve">        }</w:t>
+      </w:r>
+    </w:p>
+    <w:p/>
+    <w:p>
+      <w:r>
+        <w:t xml:space="preserve">        while (</w:t>
+      </w:r>
+      <w:proofErr w:type="spellStart"/>
+      <w:r>
+        <w:t>i</w:t>
+      </w:r>
+      <w:proofErr w:type="spellEnd"/>
+      <w:r>
+        <w:t xml:space="preserve"> &lt; n1) {</w:t>
+      </w:r>
+    </w:p>
+    <w:p>
+      <w:r>
+        <w:t xml:space="preserve">            </w:t>
+      </w:r>
+      <w:proofErr w:type="spellStart"/>
+      <w:r>
+        <w:t>arr</w:t>
+      </w:r>
+      <w:proofErr w:type="spellEnd"/>
+      <w:r>
+        <w:t>[k] = L[</w:t>
+      </w:r>
+      <w:proofErr w:type="spellStart"/>
+      <w:r>
+        <w:t>i</w:t>
+      </w:r>
+      <w:proofErr w:type="spellEnd"/>
+      <w:r>
+        <w:t>];</w:t>
+      </w:r>
+    </w:p>
+    <w:p>
+      <w:r>
+        <w:t xml:space="preserve">            </w:t>
+      </w:r>
+      <w:proofErr w:type="spellStart"/>
+      <w:r>
+        <w:t>i</w:t>
+      </w:r>
+      <w:proofErr w:type="spellEnd"/>
+      <w:r>
+        <w:t>++;</w:t>
+      </w:r>
+    </w:p>
+    <w:p>
+      <w:r>
+        <w:t xml:space="preserve">            k++;</w:t>
+      </w:r>
+    </w:p>
+    <w:p>
+      <w:r>
+        <w:t xml:space="preserve">        }</w:t>
+      </w:r>
+    </w:p>
+    <w:p/>
+    <w:p>
+      <w:r>
+        <w:t xml:space="preserve">        while (j &lt; n2) {</w:t>
+      </w:r>
+    </w:p>
+    <w:p>
+      <w:r>
+        <w:t xml:space="preserve">            </w:t>
+      </w:r>
+      <w:proofErr w:type="spellStart"/>
+      <w:r>
+        <w:t>arr</w:t>
+      </w:r>
+      <w:proofErr w:type="spellEnd"/>
+      <w:r>
+        <w:t>[k] = R[j];</w:t>
+      </w:r>
+    </w:p>
+    <w:p>
+      <w:r>
+        <w:lastRenderedPageBreak/>
+        <w:t xml:space="preserve">            </w:t>
+      </w:r>
+      <w:proofErr w:type="spellStart"/>
+      <w:r>
+        <w:t>j++</w:t>
+      </w:r>
+      <w:proofErr w:type="spellEnd"/>
+      <w:r>
+        <w:t>;</w:t>
+      </w:r>
+    </w:p>
+    <w:p>
+      <w:r>
+        <w:t xml:space="preserve">            k++;</w:t>
+      </w:r>
+    </w:p>
+    <w:p>
+      <w:r>
+        <w:t xml:space="preserve">        }</w:t>
+      </w:r>
+    </w:p>
+    <w:p>
+      <w:r>
+        <w:t xml:space="preserve">    }</w:t>
+      </w:r>
+    </w:p>
+    <w:p/>
+    <w:p>
+      <w:r>
+        <w:t xml:space="preserve">    static void </w:t>
+      </w:r>
+      <w:proofErr w:type="spellStart"/>
+      <w:r>
+        <w:t>mergeSort</w:t>
+      </w:r>
+      <w:proofErr w:type="spellEnd"/>
+      <w:r>
+        <w:t>(</w:t>
+      </w:r>
+      <w:proofErr w:type="gramStart"/>
+      <w:r>
+        <w:t>int[</w:t>
+      </w:r>
+      <w:proofErr w:type="gramEnd"/>
+      <w:r>
+        <w:t xml:space="preserve">] </w:t>
+      </w:r>
+      <w:proofErr w:type="spellStart"/>
+      <w:r>
+        <w:t>arr</w:t>
+      </w:r>
+      <w:proofErr w:type="spellEnd"/>
+      <w:r>
+        <w:t>, int left, int right) {</w:t>
+      </w:r>
+    </w:p>
+    <w:p/>
+    <w:p>
+      <w:r>
+        <w:t xml:space="preserve">        if (left &lt; right) {</w:t>
+      </w:r>
+    </w:p>
+    <w:p/>
+    <w:p>
+      <w:r>
+        <w:t xml:space="preserve">            int mid = (left + right) / 2;</w:t>
+      </w:r>
+    </w:p>
+    <w:p/>
+    <w:p>
+      <w:r>
+        <w:t xml:space="preserve">            </w:t>
+      </w:r>
+      <w:proofErr w:type="spellStart"/>
+      <w:proofErr w:type="gramStart"/>
+      <w:r>
+        <w:t>mergeSort</w:t>
+      </w:r>
+      <w:proofErr w:type="spellEnd"/>
+      <w:r>
+        <w:t>(</w:t>
+      </w:r>
+      <w:proofErr w:type="spellStart"/>
+      <w:proofErr w:type="gramEnd"/>
+      <w:r>
+        <w:t>arr</w:t>
+      </w:r>
+      <w:proofErr w:type="spellEnd"/>
+      <w:r>
+        <w:t>, left, mid);</w:t>
+      </w:r>
+    </w:p>
+    <w:p>
+      <w:r>
+        <w:t xml:space="preserve">            </w:t>
+      </w:r>
+      <w:proofErr w:type="spellStart"/>
+      <w:proofErr w:type="gramStart"/>
+      <w:r>
+        <w:t>mergeSort</w:t>
+      </w:r>
+      <w:proofErr w:type="spellEnd"/>
+      <w:r>
+        <w:t>(</w:t>
+      </w:r>
+      <w:proofErr w:type="spellStart"/>
+      <w:proofErr w:type="gramEnd"/>
+      <w:r>
+        <w:t>arr</w:t>
+      </w:r>
+      <w:proofErr w:type="spellEnd"/>
+      <w:r>
+        <w:t>, mid + 1, right);</w:t>
+      </w:r>
+    </w:p>
+    <w:p/>
+    <w:p>
+      <w:r>
+        <w:t xml:space="preserve">            </w:t>
+      </w:r>
+      <w:proofErr w:type="gramStart"/>
+      <w:r>
+        <w:t>merge(</w:t>
+      </w:r>
+      <w:proofErr w:type="spellStart"/>
+      <w:proofErr w:type="gramEnd"/>
+      <w:r>
+        <w:t>arr</w:t>
+      </w:r>
+      <w:proofErr w:type="spellEnd"/>
+      <w:r>
+        <w:t>, left, mid, right);</w:t>
+      </w:r>
+    </w:p>
+    <w:p>
+      <w:r>
+        <w:t xml:space="preserve">        }</w:t>
+      </w:r>
+    </w:p>
+    <w:p>
+      <w:r>
+        <w:t xml:space="preserve">    }</w:t>
+      </w:r>
+    </w:p>
+    <w:p/>
+    <w:p>
+      <w:r>
+        <w:t xml:space="preserve">    public static void </w:t>
+      </w:r>
+      <w:proofErr w:type="gramStart"/>
+      <w:r>
+        <w:t>main(String[</w:t>
+      </w:r>
+      <w:proofErr w:type="gramEnd"/>
+      <w:r>
+        <w:t xml:space="preserve">] </w:t>
+      </w:r>
+      <w:proofErr w:type="spellStart"/>
+      <w:r>
+        <w:t>args</w:t>
+      </w:r>
+      <w:proofErr w:type="spellEnd"/>
+      <w:r>
+        <w:t>) {</w:t>
+      </w:r>
+    </w:p>
+    <w:p/>
+    <w:p>
+      <w:r>
+        <w:t xml:space="preserve">        </w:t>
+      </w:r>
+      <w:proofErr w:type="gramStart"/>
+      <w:r>
+        <w:t>int[</w:t>
+      </w:r>
+      <w:proofErr w:type="gramEnd"/>
+      <w:r>
+        <w:t xml:space="preserve">] </w:t>
+      </w:r>
+      <w:proofErr w:type="spellStart"/>
+      <w:r>
+        <w:t>arr</w:t>
+      </w:r>
+      <w:proofErr w:type="spellEnd"/>
+      <w:r>
+        <w:t xml:space="preserve"> = {5, 3, 8, 1, 2};</w:t>
+      </w:r>
+    </w:p>
+    <w:p/>
+    <w:p>
+      <w:r>
+        <w:t xml:space="preserve">        </w:t>
+      </w:r>
+      <w:proofErr w:type="spellStart"/>
+      <w:proofErr w:type="gramStart"/>
+      <w:r>
+        <w:t>mergeSort</w:t>
+      </w:r>
+      <w:proofErr w:type="spellEnd"/>
+      <w:r>
+        <w:t>(</w:t>
+      </w:r>
+      <w:proofErr w:type="spellStart"/>
+      <w:proofErr w:type="gramEnd"/>
+      <w:r>
+        <w:t>arr</w:t>
+      </w:r>
+      <w:proofErr w:type="spellEnd"/>
+      <w:r>
+        <w:t xml:space="preserve">, 0, </w:t>
+      </w:r>
+      <w:proofErr w:type="spellStart"/>
+      <w:proofErr w:type="gramStart"/>
+      <w:r>
+        <w:t>arr.length</w:t>
+      </w:r>
+      <w:proofErr w:type="spellEnd"/>
+      <w:proofErr w:type="gramEnd"/>
+      <w:r>
+        <w:t xml:space="preserve"> - 1);</w:t>
+      </w:r>
+    </w:p>
+    <w:p/>
+    <w:p>
+      <w:r>
+        <w:t xml:space="preserve">        </w:t>
+      </w:r>
+      <w:proofErr w:type="spellStart"/>
+      <w:r>
+        <w:t>System.out.println</w:t>
+      </w:r>
+      <w:proofErr w:type="spellEnd"/>
+      <w:r>
+        <w:t>("Sorted array:");</w:t>
+      </w:r>
+    </w:p>
+    <w:p/>
+    <w:p>
+      <w:r>
+        <w:t xml:space="preserve">        for (int </w:t>
+      </w:r>
+      <w:proofErr w:type="spellStart"/>
+      <w:proofErr w:type="gramStart"/>
+      <w:r>
+        <w:t>num</w:t>
+      </w:r>
+      <w:proofErr w:type="spellEnd"/>
+      <w:r>
+        <w:t xml:space="preserve"> :</w:t>
+      </w:r>
+      <w:proofErr w:type="gramEnd"/>
+      <w:r>
+        <w:t xml:space="preserve"> </w:t>
+      </w:r>
+      <w:proofErr w:type="spellStart"/>
+      <w:r>
+        <w:t>arr</w:t>
+      </w:r>
+      <w:proofErr w:type="spellEnd"/>
+      <w:r>
+        <w:t>) {</w:t>
+      </w:r>
+    </w:p>
+    <w:p>
+      <w:r>
+        <w:t xml:space="preserve">            </w:t>
+      </w:r>
+      <w:proofErr w:type="spellStart"/>
+      <w:r>
+        <w:t>System.out.print</w:t>
+      </w:r>
+      <w:proofErr w:type="spellEnd"/>
+      <w:r>
+        <w:t>(</w:t>
+      </w:r>
+      <w:proofErr w:type="spellStart"/>
+      <w:r>
+        <w:t>num</w:t>
+      </w:r>
+      <w:proofErr w:type="spellEnd"/>
+      <w:r>
+        <w:t xml:space="preserve"> + " ");</w:t>
+      </w:r>
+    </w:p>
+    <w:p>
+      <w:r>
+        <w:lastRenderedPageBreak/>
+        <w:t xml:space="preserve">        }</w:t>
+      </w:r>
+    </w:p>
+    <w:p>
+      <w:r>
+        <w:t xml:space="preserve">    }</w:t>
+      </w:r>
+    </w:p>
+    <w:p>
+      <w:r>
+        <w:t>}</w:t>
+      </w:r>
+    </w:p>
+    <w:p>
+      <w:pPr>
+        <w:rPr>
+          <w:b/>
+          <w:bCs/>
+        </w:rPr>
+      </w:pPr>
+      <w:r>
+        <w:rPr>
+          <w:b/>
+          <w:bCs/>
+        </w:rPr>
+        <w:t>Output:</w:t>
+      </w:r>
+    </w:p>
+    <w:p>
+      <w:r>
+        <w:t>Sorted array:</w:t>
+      </w:r>
+    </w:p>
+    <w:p>
+      <w:r>
+        <w:t>1 2 3 5 8</w:t>
+      </w:r>
+    </w:p>
+    <w:p>
+      <w:r>
+        <w:pict w14:anchorId="396A0DE0">
+          <v:rect id="_x0000_i1059" style="width:0;height:1.5pt" o:hralign="center" o:hrstd="t" o:hr="t" fillcolor="#a0a0a0" stroked="f"/>
+        </w:pict>
+      </w:r>
+    </w:p>
+    <w:p>
+      <w:pPr>
+        <w:rPr>
+          <w:b/>
+          <w:bCs/>
+        </w:rPr>
+      </w:pPr>
+      <w:r>
+        <w:rPr>
+          <w:b/>
+          <w:bCs/>
+        </w:rPr>
+        <w:t>3. Quick Sort</w:t>
+      </w:r>
+    </w:p>
+    <w:p>
+      <w:r>
+        <w:rPr>
+          <w:b/>
+          <w:bCs/>
+        </w:rPr>
+        <w:t>Concept:</w:t>
+      </w:r>
+      <w:r>
+        <w:t xml:space="preserve"> Quick Sort selects one element as a </w:t>
+      </w:r>
+      <w:r>
+        <w:rPr>
+          <w:b/>
+          <w:bCs/>
+        </w:rPr>
+        <w:t>pivot</w:t>
+      </w:r>
+      <w:r>
+        <w:t xml:space="preserve"> and places smaller elements on one side and larger elements on the other side.</w:t>
+      </w:r>
+    </w:p>
+    <w:p>
+      <w:r>
+        <w:rPr>
+          <w:b/>
+          <w:bCs/>
+        </w:rPr>
+        <w:t>Average Time Complexity:</w:t>
+      </w:r>
+      <w:r>
+        <w:t xml:space="preserve"> </w:t>
+      </w:r>
+      <w:proofErr w:type="gramStart"/>
+      <w:r>
+        <w:t>O(</w:t>
+      </w:r>
+      <w:proofErr w:type="gramEnd"/>
+      <w:r>
+        <w:t>n log n)</w:t>
+      </w:r>
+    </w:p>
+    <w:p>
+      <w:r>
+        <w:rPr>
+          <w:b/>
+          <w:bCs/>
+        </w:rPr>
+        <w:t>Worst Time Complexity:</w:t>
+      </w:r>
+      <w:r>
+        <w:t xml:space="preserve"> O(n²)</w:t>
+      </w:r>
+    </w:p>
+    <w:p>
+      <w:pPr>
+        <w:rPr>
+          <w:b/>
+          <w:bCs/>
+        </w:rPr>
+      </w:pPr>
+      <w:r>
+        <w:rPr>
+          <w:b/>
+          <w:bCs/>
+        </w:rPr>
+        <w:t>Java Code:</w:t>
+      </w:r>
+    </w:p>
+    <w:p>
+      <w:r>
+        <w:t xml:space="preserve">public class </w:t>
+      </w:r>
+      <w:proofErr w:type="spellStart"/>
+      <w:r>
+        <w:t>QuickSort</w:t>
+      </w:r>
+      <w:proofErr w:type="spellEnd"/>
+      <w:r>
+        <w:t xml:space="preserve"> {</w:t>
+      </w:r>
+    </w:p>
+    <w:p/>
+    <w:p>
+      <w:r>
+        <w:t xml:space="preserve">    static int partition(</w:t>
+      </w:r>
+      <w:proofErr w:type="gramStart"/>
+      <w:r>
+        <w:t>int[</w:t>
+      </w:r>
+      <w:proofErr w:type="gramEnd"/>
+      <w:r>
+        <w:t xml:space="preserve">] </w:t>
+      </w:r>
+      <w:proofErr w:type="spellStart"/>
+      <w:r>
+        <w:t>arr</w:t>
+      </w:r>
+      <w:proofErr w:type="spellEnd"/>
+      <w:r>
+        <w:t>, int low, int high) {</w:t>
+      </w:r>
+    </w:p>
+    <w:p/>
+    <w:p>
+      <w:r>
+        <w:t xml:space="preserve">        int pivot = </w:t>
+      </w:r>
+      <w:proofErr w:type="spellStart"/>
+      <w:r>
+        <w:t>arr</w:t>
+      </w:r>
+      <w:proofErr w:type="spellEnd"/>
+      <w:r>
+        <w:t>[high];</w:t>
+      </w:r>
+    </w:p>
+    <w:p>
+      <w:r>
+        <w:t xml:space="preserve">        int </w:t>
+      </w:r>
+      <w:proofErr w:type="spellStart"/>
+      <w:r>
+        <w:t>i</w:t>
+      </w:r>
+      <w:proofErr w:type="spellEnd"/>
+      <w:r>
+        <w:t xml:space="preserve"> = low - 1;</w:t>
+      </w:r>
+    </w:p>
+    <w:p/>
+    <w:p>
+      <w:r>
+        <w:t xml:space="preserve">        for (int j = low; j &lt; high; </w:t>
+      </w:r>
+      <w:proofErr w:type="spellStart"/>
+      <w:r>
+        <w:t>j++</w:t>
+      </w:r>
+      <w:proofErr w:type="spellEnd"/>
+      <w:r>
+        <w:t>) {</w:t>
+      </w:r>
+    </w:p>
+    <w:p/>
+    <w:p>
+      <w:r>
+        <w:t xml:space="preserve">            if (</w:t>
+      </w:r>
+      <w:proofErr w:type="spellStart"/>
+      <w:r>
+        <w:t>arr</w:t>
+      </w:r>
+      <w:proofErr w:type="spellEnd"/>
+      <w:r>
+        <w:t>[j] &lt; pivot) {</w:t>
+      </w:r>
+    </w:p>
+    <w:p/>
+    <w:p>
+      <w:r>
+        <w:t xml:space="preserve">                </w:t>
+      </w:r>
+      <w:proofErr w:type="spellStart"/>
+      <w:r>
+        <w:t>i</w:t>
+      </w:r>
+      <w:proofErr w:type="spellEnd"/>
+      <w:r>
+        <w:t>++;</w:t>
+      </w:r>
+    </w:p>
+    <w:p/>
+    <w:p>
+      <w:r>
+        <w:t xml:space="preserve">                int temp = </w:t>
+      </w:r>
+      <w:proofErr w:type="spellStart"/>
+      <w:r>
+        <w:t>arr</w:t>
+      </w:r>
+      <w:proofErr w:type="spellEnd"/>
+      <w:r>
+        <w:t>[</w:t>
+      </w:r>
+      <w:proofErr w:type="spellStart"/>
+      <w:r>
+        <w:t>i</w:t>
+      </w:r>
+      <w:proofErr w:type="spellEnd"/>
+      <w:r>
+        <w:t>];</w:t>
+      </w:r>
+    </w:p>
+    <w:p>
+      <w:r>
+        <w:t xml:space="preserve">                </w:t>
+      </w:r>
+      <w:proofErr w:type="spellStart"/>
+      <w:r>
+        <w:t>arr</w:t>
+      </w:r>
+      <w:proofErr w:type="spellEnd"/>
+      <w:r>
+        <w:t>[</w:t>
+      </w:r>
+      <w:proofErr w:type="spellStart"/>
+      <w:r>
+        <w:t>i</w:t>
+      </w:r>
+      <w:proofErr w:type="spellEnd"/>
+      <w:r>
+        <w:t xml:space="preserve">] = </w:t>
+      </w:r>
+      <w:proofErr w:type="spellStart"/>
+      <w:r>
+        <w:t>arr</w:t>
+      </w:r>
+      <w:proofErr w:type="spellEnd"/>
+      <w:r>
+        <w:t>[j];</w:t>
+      </w:r>
+    </w:p>
+    <w:p>
+      <w:r>
+        <w:lastRenderedPageBreak/>
+        <w:t xml:space="preserve">                </w:t>
+      </w:r>
+      <w:proofErr w:type="spellStart"/>
+      <w:r>
+        <w:t>arr</w:t>
+      </w:r>
+      <w:proofErr w:type="spellEnd"/>
+      <w:r>
+        <w:t>[j] = temp;</w:t>
+      </w:r>
+    </w:p>
+    <w:p>
+      <w:r>
+        <w:t xml:space="preserve">            }</w:t>
+      </w:r>
+    </w:p>
+    <w:p>
+      <w:r>
+        <w:t xml:space="preserve">        }</w:t>
+      </w:r>
+    </w:p>
+    <w:p/>
+    <w:p>
+      <w:r>
+        <w:t xml:space="preserve">        int temp = </w:t>
+      </w:r>
+      <w:proofErr w:type="spellStart"/>
+      <w:proofErr w:type="gramStart"/>
+      <w:r>
+        <w:t>arr</w:t>
+      </w:r>
+      <w:proofErr w:type="spellEnd"/>
+      <w:r>
+        <w:t>[</w:t>
+      </w:r>
+      <w:proofErr w:type="spellStart"/>
+      <w:proofErr w:type="gramEnd"/>
+      <w:r>
+        <w:t>i</w:t>
+      </w:r>
+      <w:proofErr w:type="spellEnd"/>
+      <w:r>
+        <w:t xml:space="preserve"> + 1];</w:t>
+      </w:r>
+    </w:p>
+    <w:p>
+      <w:r>
+        <w:t xml:space="preserve">        </w:t>
+      </w:r>
+      <w:proofErr w:type="spellStart"/>
+      <w:proofErr w:type="gramStart"/>
+      <w:r>
+        <w:t>arr</w:t>
+      </w:r>
+      <w:proofErr w:type="spellEnd"/>
+      <w:r>
+        <w:t>[</w:t>
+      </w:r>
+      <w:proofErr w:type="spellStart"/>
+      <w:proofErr w:type="gramEnd"/>
+      <w:r>
+        <w:t>i</w:t>
+      </w:r>
+      <w:proofErr w:type="spellEnd"/>
+      <w:r>
+        <w:t xml:space="preserve"> + 1] = </w:t>
+      </w:r>
+      <w:proofErr w:type="spellStart"/>
+      <w:r>
+        <w:t>arr</w:t>
+      </w:r>
+      <w:proofErr w:type="spellEnd"/>
+      <w:r>
+        <w:t>[high];</w:t>
+      </w:r>
+    </w:p>
+    <w:p>
+      <w:r>
+        <w:t xml:space="preserve">        </w:t>
+      </w:r>
+      <w:proofErr w:type="spellStart"/>
+      <w:r>
+        <w:t>arr</w:t>
+      </w:r>
+      <w:proofErr w:type="spellEnd"/>
+      <w:r>
+        <w:t>[high] = temp;</w:t>
+      </w:r>
+    </w:p>
+    <w:p/>
+    <w:p>
+      <w:r>
+        <w:t xml:space="preserve">        return </w:t>
+      </w:r>
+      <w:proofErr w:type="spellStart"/>
+      <w:r>
+        <w:t>i</w:t>
+      </w:r>
+      <w:proofErr w:type="spellEnd"/>
+      <w:r>
+        <w:t xml:space="preserve"> + 1;</w:t>
+      </w:r>
+    </w:p>
+    <w:p>
+      <w:r>
+        <w:t xml:space="preserve">    }</w:t>
+      </w:r>
+    </w:p>
+    <w:p/>
+    <w:p>
+      <w:r>
+        <w:t xml:space="preserve">    static void </w:t>
+      </w:r>
+      <w:proofErr w:type="spellStart"/>
+      <w:r>
+        <w:t>quickSort</w:t>
+      </w:r>
+      <w:proofErr w:type="spellEnd"/>
+      <w:r>
+        <w:t>(</w:t>
+      </w:r>
+      <w:proofErr w:type="gramStart"/>
+      <w:r>
+        <w:t>int[</w:t>
+      </w:r>
+      <w:proofErr w:type="gramEnd"/>
+      <w:r>
+        <w:t xml:space="preserve">] </w:t>
+      </w:r>
+      <w:proofErr w:type="spellStart"/>
+      <w:r>
+        <w:t>arr</w:t>
+      </w:r>
+      <w:proofErr w:type="spellEnd"/>
+      <w:r>
+        <w:t>, int low, int high) {</w:t>
+      </w:r>
+    </w:p>
+    <w:p/>
+    <w:p>
+      <w:r>
+        <w:t xml:space="preserve">        if (low &lt; high) {</w:t>
+      </w:r>
+    </w:p>
+    <w:p/>
+    <w:p>
+      <w:r>
+        <w:t xml:space="preserve">            int </w:t>
+      </w:r>
+      <w:proofErr w:type="spellStart"/>
+      <w:r>
+        <w:t>pivotIndex</w:t>
+      </w:r>
+      <w:proofErr w:type="spellEnd"/>
+      <w:r>
+        <w:t xml:space="preserve"> = </w:t>
+      </w:r>
+      <w:proofErr w:type="gramStart"/>
+      <w:r>
+        <w:t>partition(</w:t>
+      </w:r>
+      <w:proofErr w:type="spellStart"/>
+      <w:proofErr w:type="gramEnd"/>
+      <w:r>
+        <w:t>arr</w:t>
+      </w:r>
+      <w:proofErr w:type="spellEnd"/>
+      <w:r>
+        <w:t>, low, high);</w:t>
+      </w:r>
+    </w:p>
+    <w:p/>
+    <w:p>
+      <w:r>
+        <w:t xml:space="preserve">            </w:t>
+      </w:r>
+      <w:proofErr w:type="spellStart"/>
+      <w:proofErr w:type="gramStart"/>
+      <w:r>
+        <w:t>quickSort</w:t>
+      </w:r>
+      <w:proofErr w:type="spellEnd"/>
+      <w:r>
+        <w:t>(</w:t>
+      </w:r>
+      <w:proofErr w:type="spellStart"/>
+      <w:proofErr w:type="gramEnd"/>
+      <w:r>
+        <w:t>arr</w:t>
+      </w:r>
+      <w:proofErr w:type="spellEnd"/>
+      <w:r>
+        <w:t xml:space="preserve">, low, </w:t>
+      </w:r>
+      <w:proofErr w:type="spellStart"/>
+      <w:r>
+        <w:t>pivotIndex</w:t>
+      </w:r>
+      <w:proofErr w:type="spellEnd"/>
+      <w:r>
+        <w:t xml:space="preserve"> - 1);</w:t>
+      </w:r>
+    </w:p>
+    <w:p>
+      <w:r>
+        <w:t xml:space="preserve">            </w:t>
+      </w:r>
+      <w:proofErr w:type="spellStart"/>
+      <w:proofErr w:type="gramStart"/>
+      <w:r>
+        <w:t>quickSort</w:t>
+      </w:r>
+      <w:proofErr w:type="spellEnd"/>
+      <w:r>
+        <w:t>(</w:t>
+      </w:r>
+      <w:proofErr w:type="spellStart"/>
+      <w:proofErr w:type="gramEnd"/>
+      <w:r>
+        <w:t>arr</w:t>
+      </w:r>
+      <w:proofErr w:type="spellEnd"/>
+      <w:r>
+        <w:t xml:space="preserve">, </w:t>
+      </w:r>
+      <w:proofErr w:type="spellStart"/>
+      <w:r>
+        <w:t>pivotIndex</w:t>
+      </w:r>
+      <w:proofErr w:type="spellEnd"/>
+      <w:r>
+        <w:t xml:space="preserve"> + 1, high);</w:t>
+      </w:r>
+    </w:p>
+    <w:p>
+      <w:r>
+        <w:t xml:space="preserve">        }</w:t>
+      </w:r>
+    </w:p>
+    <w:p>
+      <w:r>
+        <w:t xml:space="preserve">    }</w:t>
+      </w:r>
+    </w:p>
+    <w:p/>
+    <w:p>
+      <w:r>
+        <w:t xml:space="preserve">    public static void </w:t>
+      </w:r>
+      <w:proofErr w:type="gramStart"/>
+      <w:r>
+        <w:t>main(String[</w:t>
+      </w:r>
+      <w:proofErr w:type="gramEnd"/>
+      <w:r>
+        <w:t xml:space="preserve">] </w:t>
+      </w:r>
+      <w:proofErr w:type="spellStart"/>
+      <w:r>
+        <w:t>args</w:t>
+      </w:r>
+      <w:proofErr w:type="spellEnd"/>
+      <w:r>
+        <w:t>) {</w:t>
+      </w:r>
+    </w:p>
+    <w:p/>
+    <w:p>
+      <w:r>
+        <w:t xml:space="preserve">        </w:t>
+      </w:r>
+      <w:proofErr w:type="gramStart"/>
+      <w:r>
+        <w:t>int[</w:t>
+      </w:r>
+      <w:proofErr w:type="gramEnd"/>
+      <w:r>
+        <w:t xml:space="preserve">] </w:t>
+      </w:r>
+      <w:proofErr w:type="spellStart"/>
+      <w:r>
+        <w:t>arr</w:t>
+      </w:r>
+      <w:proofErr w:type="spellEnd"/>
+      <w:r>
+        <w:t xml:space="preserve"> = {5, 3, 8, 1, 2};</w:t>
+      </w:r>
+    </w:p>
+    <w:p/>
+    <w:p>
+      <w:r>
+        <w:t xml:space="preserve">        </w:t>
+      </w:r>
+      <w:proofErr w:type="spellStart"/>
+      <w:proofErr w:type="gramStart"/>
+      <w:r>
+        <w:t>quickSort</w:t>
+      </w:r>
+      <w:proofErr w:type="spellEnd"/>
+      <w:r>
+        <w:t>(</w:t>
+      </w:r>
+      <w:proofErr w:type="spellStart"/>
+      <w:proofErr w:type="gramEnd"/>
+      <w:r>
+        <w:t>arr</w:t>
+      </w:r>
+      <w:proofErr w:type="spellEnd"/>
+      <w:r>
+        <w:t xml:space="preserve">, 0, </w:t>
+      </w:r>
+      <w:proofErr w:type="spellStart"/>
+      <w:proofErr w:type="gramStart"/>
+      <w:r>
+        <w:t>arr.length</w:t>
+      </w:r>
+      <w:proofErr w:type="spellEnd"/>
+      <w:proofErr w:type="gramEnd"/>
+      <w:r>
+        <w:t xml:space="preserve"> - 1);</w:t>
+      </w:r>
+    </w:p>
+    <w:p/>
+    <w:p>
+      <w:r>
+        <w:lastRenderedPageBreak/>
+        <w:t xml:space="preserve">        </w:t>
+      </w:r>
+      <w:proofErr w:type="spellStart"/>
+      <w:r>
+        <w:t>System.out.println</w:t>
+      </w:r>
+      <w:proofErr w:type="spellEnd"/>
+      <w:r>
+        <w:t>("Sorted array:");</w:t>
+      </w:r>
+    </w:p>
+    <w:p/>
+    <w:p>
+      <w:r>
+        <w:t xml:space="preserve">        for (int </w:t>
+      </w:r>
+      <w:proofErr w:type="spellStart"/>
+      <w:proofErr w:type="gramStart"/>
+      <w:r>
+        <w:t>num</w:t>
+      </w:r>
+      <w:proofErr w:type="spellEnd"/>
+      <w:r>
+        <w:t xml:space="preserve"> :</w:t>
+      </w:r>
+      <w:proofErr w:type="gramEnd"/>
+      <w:r>
+        <w:t xml:space="preserve"> </w:t>
+      </w:r>
+      <w:proofErr w:type="spellStart"/>
+      <w:r>
+        <w:t>arr</w:t>
+      </w:r>
+      <w:proofErr w:type="spellEnd"/>
+      <w:r>
+        <w:t>) {</w:t>
+      </w:r>
+    </w:p>
+    <w:p>
+      <w:r>
+        <w:t xml:space="preserve">            </w:t>
+      </w:r>
+      <w:proofErr w:type="spellStart"/>
+      <w:r>
+        <w:t>System.out.print</w:t>
+      </w:r>
+      <w:proofErr w:type="spellEnd"/>
+      <w:r>
+        <w:t>(</w:t>
+      </w:r>
+      <w:proofErr w:type="spellStart"/>
+      <w:r>
+        <w:t>num</w:t>
+      </w:r>
+      <w:proofErr w:type="spellEnd"/>
+      <w:r>
+        <w:t xml:space="preserve"> + " ");</w:t>
+      </w:r>
+    </w:p>
+    <w:p>
+      <w:r>
+        <w:t xml:space="preserve">        }</w:t>
+      </w:r>
+    </w:p>
+    <w:p>
+      <w:r>
+        <w:t xml:space="preserve">    }</w:t>
+      </w:r>
+    </w:p>
+    <w:p>
+      <w:r>
+        <w:t>}</w:t>
+      </w:r>
+    </w:p>
+    <w:p>
+      <w:pPr>
+        <w:rPr>
+          <w:b/>
+          <w:bCs/>
+        </w:rPr>
+      </w:pPr>
+      <w:r>
+        <w:rPr>
+          <w:b/>
+          <w:bCs/>
+        </w:rPr>
+        <w:t>Output:</w:t>
+      </w:r>
+    </w:p>
+    <w:p>
+      <w:r>
+        <w:t>Sorted array:</w:t>
+      </w:r>
+    </w:p>
+    <w:p>
+      <w:r>
+        <w:t>1 2 3 5 8</w:t>
+      </w:r>
+    </w:p>
+    <w:p>
+      <w:r>
+        <w:pict w14:anchorId="34A309D7">
+          <v:rect id="_x0000_i1060" style="width:0;height:1.5pt" o:hralign="center" o:hrstd="t" o:hr="t" fillcolor="#a0a0a0" stroked="f"/>
+        </w:pict>
+      </w:r>
+    </w:p>
+    <w:p>
+      <w:pPr>
+        <w:rPr>
+          <w:b/>
+          <w:bCs/>
+        </w:rPr>
+      </w:pPr>
+      <w:r>
+        <w:rPr>
+          <w:b/>
+          <w:bCs/>
+        </w:rPr>
+        <w:t>4. Binary Search</w:t>
+      </w:r>
+    </w:p>
+    <w:p>
+      <w:r>
+        <w:rPr>
+          <w:b/>
+          <w:bCs/>
+        </w:rPr>
+        <w:t>Concept:</w:t>
+      </w:r>
+      <w:r>
+        <w:t xml:space="preserve"> Binary Search repeatedly divides a </w:t>
+      </w:r>
+      <w:r>
+        <w:rPr>
+          <w:b/>
+          <w:bCs/>
+        </w:rPr>
+        <w:t>sorted array</w:t>
+      </w:r>
+      <w:r>
+        <w:t xml:space="preserve"> into two halves until the required element is found.</w:t>
+      </w:r>
+    </w:p>
+    <w:p>
+      <w:r>
+        <w:rPr>
+          <w:b/>
+          <w:bCs/>
+        </w:rPr>
+        <w:t>Time Complexity:</w:t>
+      </w:r>
+      <w:r>
+        <w:t xml:space="preserve"> </w:t>
+      </w:r>
+      <w:proofErr w:type="gramStart"/>
+      <w:r>
+        <w:t>O(</w:t>
+      </w:r>
+      <w:proofErr w:type="gramEnd"/>
+      <w:r>
+        <w:t>log n)</w:t>
+      </w:r>
+    </w:p>
+    <w:p>
+      <w:r>
+        <w:rPr>
+          <w:b/>
+          <w:bCs/>
+        </w:rPr>
+        <w:t>Important:</w:t>
+      </w:r>
+      <w:r>
+        <w:t xml:space="preserve"> The array must be </w:t>
+      </w:r>
+      <w:r>
+        <w:rPr>
+          <w:b/>
+          <w:bCs/>
+        </w:rPr>
+        <w:t>sorted</w:t>
+      </w:r>
+      <w:r>
+        <w:t xml:space="preserve"> before using Binary Search.</w:t>
+      </w:r>
+    </w:p>
+    <w:p>
+      <w:pPr>
+        <w:rPr>
+          <w:b/>
+          <w:bCs/>
+        </w:rPr>
+      </w:pPr>
+      <w:r>
+        <w:rPr>
+          <w:b/>
+          <w:bCs/>
+        </w:rPr>
+        <w:t>Java Code:</w:t>
+      </w:r>
+    </w:p>
+    <w:p>
+      <w:r>
+        <w:t xml:space="preserve">public class </w:t>
+      </w:r>
+      <w:proofErr w:type="spellStart"/>
+      <w:r>
+        <w:t>BinarySearch</w:t>
+      </w:r>
+      <w:proofErr w:type="spellEnd"/>
+      <w:r>
+        <w:t xml:space="preserve"> {</w:t>
+      </w:r>
+    </w:p>
+    <w:p/>
+    <w:p>
+      <w:r>
+        <w:t xml:space="preserve">    static int </w:t>
+      </w:r>
+      <w:proofErr w:type="spellStart"/>
+      <w:r>
+        <w:t>binarySearch</w:t>
+      </w:r>
+      <w:proofErr w:type="spellEnd"/>
+      <w:r>
+        <w:t>(</w:t>
+      </w:r>
+      <w:proofErr w:type="gramStart"/>
+      <w:r>
+        <w:t>int[</w:t>
+      </w:r>
+      <w:proofErr w:type="gramEnd"/>
+      <w:r>
+        <w:t xml:space="preserve">] </w:t>
+      </w:r>
+      <w:proofErr w:type="spellStart"/>
+      <w:r>
+        <w:t>arr</w:t>
+      </w:r>
+      <w:proofErr w:type="spellEnd"/>
+      <w:r>
+        <w:t>, int key) {</w:t>
+      </w:r>
+    </w:p>
+    <w:p/>
+    <w:p>
+      <w:r>
+        <w:t xml:space="preserve">        int low = 0;</w:t>
+      </w:r>
+    </w:p>
+    <w:p>
+      <w:r>
+        <w:t xml:space="preserve">        int high = </w:t>
+      </w:r>
+      <w:proofErr w:type="spellStart"/>
+      <w:proofErr w:type="gramStart"/>
+      <w:r>
+        <w:t>arr.length</w:t>
+      </w:r>
+      <w:proofErr w:type="spellEnd"/>
+      <w:proofErr w:type="gramEnd"/>
+      <w:r>
+        <w:t xml:space="preserve"> - 1;</w:t>
+      </w:r>
+    </w:p>
+    <w:p/>
+    <w:p>
+      <w:r>
+        <w:t xml:space="preserve">        while (low &lt;= high) {</w:t>
+      </w:r>
+    </w:p>
+    <w:p/>
+    <w:p>
+      <w:r>
+        <w:t xml:space="preserve">            int mid = (low + high) / 2;</w:t>
+      </w:r>
+    </w:p>
+    <w:p/>
+    <w:p>
+      <w:r>
+        <w:lastRenderedPageBreak/>
+        <w:t xml:space="preserve">            if (</w:t>
+      </w:r>
+      <w:proofErr w:type="spellStart"/>
+      <w:r>
+        <w:t>arr</w:t>
+      </w:r>
+      <w:proofErr w:type="spellEnd"/>
+      <w:r>
+        <w:t>[mid] == key) {</w:t>
+      </w:r>
+    </w:p>
+    <w:p>
+      <w:r>
+        <w:t xml:space="preserve">                return mid;</w:t>
+      </w:r>
+    </w:p>
+    <w:p>
+      <w:r>
+        <w:t xml:space="preserve">            }</w:t>
+      </w:r>
+    </w:p>
+    <w:p/>
+    <w:p>
+      <w:r>
+        <w:t xml:space="preserve">            if (</w:t>
+      </w:r>
+      <w:proofErr w:type="spellStart"/>
+      <w:r>
+        <w:t>arr</w:t>
+      </w:r>
+      <w:proofErr w:type="spellEnd"/>
+      <w:r>
+        <w:t>[mid] &lt; key) {</w:t>
+      </w:r>
+    </w:p>
+    <w:p>
+      <w:r>
+        <w:t xml:space="preserve">                low = mid + 1;</w:t>
+      </w:r>
+    </w:p>
+    <w:p>
+      <w:r>
+        <w:t xml:space="preserve">            } else {</w:t>
+      </w:r>
+    </w:p>
+    <w:p>
+      <w:r>
+        <w:t xml:space="preserve">                high = mid - 1;</w:t>
+      </w:r>
+    </w:p>
+    <w:p>
+      <w:r>
+        <w:t xml:space="preserve">            }</w:t>
+      </w:r>
+    </w:p>
+    <w:p>
+      <w:r>
+        <w:t xml:space="preserve">        }</w:t>
+      </w:r>
+    </w:p>
+    <w:p/>
+    <w:p>
+      <w:r>
+        <w:t xml:space="preserve">        return -1;</w:t>
+      </w:r>
+    </w:p>
+    <w:p>
+      <w:r>
+        <w:t xml:space="preserve">    }</w:t>
+      </w:r>
+    </w:p>
+    <w:p/>
+    <w:p>
+      <w:r>
+        <w:t xml:space="preserve">    public static void </w:t>
+      </w:r>
+      <w:proofErr w:type="gramStart"/>
+      <w:r>
+        <w:t>main(String[</w:t>
+      </w:r>
+      <w:proofErr w:type="gramEnd"/>
+      <w:r>
+        <w:t xml:space="preserve">] </w:t>
+      </w:r>
+      <w:proofErr w:type="spellStart"/>
+      <w:r>
+        <w:t>args</w:t>
+      </w:r>
+      <w:proofErr w:type="spellEnd"/>
+      <w:r>
+        <w:t>) {</w:t>
+      </w:r>
+    </w:p>
+    <w:p/>
+    <w:p>
+      <w:r>
+        <w:t xml:space="preserve">        </w:t>
+      </w:r>
+      <w:proofErr w:type="gramStart"/>
+      <w:r>
+        <w:t>int[</w:t>
+      </w:r>
+      <w:proofErr w:type="gramEnd"/>
+      <w:r>
+        <w:t xml:space="preserve">] </w:t>
+      </w:r>
+      <w:proofErr w:type="spellStart"/>
+      <w:r>
+        <w:t>arr</w:t>
+      </w:r>
+      <w:proofErr w:type="spellEnd"/>
+      <w:r>
+        <w:t xml:space="preserve"> = {1, 2, 3, 5, 8};</w:t>
+      </w:r>
+    </w:p>
+    <w:p/>
+    <w:p>
+      <w:r>
+        <w:t xml:space="preserve">        int key = 5;</w:t>
+      </w:r>
+    </w:p>
+    <w:p/>
+    <w:p>
+      <w:r>
+        <w:t xml:space="preserve">        int result = </w:t>
+      </w:r>
+      <w:proofErr w:type="spellStart"/>
+      <w:proofErr w:type="gramStart"/>
+      <w:r>
+        <w:t>binarySearch</w:t>
+      </w:r>
+      <w:proofErr w:type="spellEnd"/>
+      <w:r>
+        <w:t>(</w:t>
+      </w:r>
+      <w:proofErr w:type="spellStart"/>
+      <w:proofErr w:type="gramEnd"/>
+      <w:r>
+        <w:t>arr</w:t>
+      </w:r>
+      <w:proofErr w:type="spellEnd"/>
+      <w:r>
+        <w:t>, key);</w:t>
+      </w:r>
+    </w:p>
+    <w:p/>
+    <w:p>
+      <w:r>
+        <w:t xml:space="preserve">        if (</w:t>
+      </w:r>
+      <w:proofErr w:type="gramStart"/>
+      <w:r>
+        <w:t>result !</w:t>
+      </w:r>
+      <w:proofErr w:type="gramEnd"/>
+      <w:r>
+        <w:t>= -1) {</w:t>
+      </w:r>
+    </w:p>
+    <w:p>
+      <w:r>
+        <w:t xml:space="preserve">            </w:t>
+      </w:r>
+      <w:proofErr w:type="spellStart"/>
+      <w:r>
+        <w:t>System.out.println</w:t>
+      </w:r>
+      <w:proofErr w:type="spellEnd"/>
+      <w:r>
+        <w:t>("Element found at index: " + result);</w:t>
+      </w:r>
+    </w:p>
+    <w:p>
+      <w:r>
+        <w:t xml:space="preserve">        } else {</w:t>
+      </w:r>
+    </w:p>
+    <w:p>
+      <w:r>
+        <w:t xml:space="preserve">            </w:t>
+      </w:r>
+      <w:proofErr w:type="spellStart"/>
+      <w:r>
+        <w:t>System.out.println</w:t>
+      </w:r>
+      <w:proofErr w:type="spellEnd"/>
+      <w:r>
+        <w:t>("Element not found");</w:t>
+      </w:r>
+    </w:p>
+    <w:p>
+      <w:r>
+        <w:t xml:space="preserve">        }</w:t>
+      </w:r>
+    </w:p>
+    <w:p>
+      <w:r>
+        <w:t xml:space="preserve">    }</w:t>
+      </w:r>
+    </w:p>
+    <w:p>
+      <w:r>
+        <w:lastRenderedPageBreak/>
+        <w:t>}</w:t>
+      </w:r>
+    </w:p>
+    <w:p>
+      <w:pPr>
+        <w:rPr>
+          <w:b/>
+          <w:bCs/>
+        </w:rPr>
+      </w:pPr>
+      <w:r>
+        <w:rPr>
+          <w:b/>
+          <w:bCs/>
+        </w:rPr>
+        <w:t>Output:</w:t>
+      </w:r>
+    </w:p>
+    <w:p>
+      <w:r>
+        <w:t>Element found at index: 3</w:t>
+      </w:r>
+    </w:p>
     <w:p>
       <w:pPr>
         <w:rPr>
@@ -4305,19 +8014,48 @@
     </w:p>
     <w:p>
       <w:r>
-        <w:t>The program checks the elements one by one:</w:t>
-      </w:r>
-    </w:p>
-    <w:p>
-      <w:r>
-        <w:t>10 → 20 → 30</w:t>
-      </w:r>
-    </w:p>
-    <w:p>
-      <w:r>
-        <w:t>When it finds 30, it stops searching and prints its index.</w:t>
-      </w:r>
-    </w:p>
+        <w:t>The array is:</w:t>
+      </w:r>
+    </w:p>
+    <w:p>
+      <w:proofErr w:type="gramStart"/>
+      <w:r>
+        <w:t>1  2</w:t>
+      </w:r>
+      <w:proofErr w:type="gramEnd"/>
+      <w:r>
+        <w:t xml:space="preserve">  </w:t>
+      </w:r>
+      <w:proofErr w:type="gramStart"/>
+      <w:r>
+        <w:t>3  5</w:t>
+      </w:r>
+      <w:proofErr w:type="gramEnd"/>
+      <w:r>
+        <w:t xml:space="preserve">  8</w:t>
+      </w:r>
+    </w:p>
+    <w:p>
+      <w:r>
+        <w:t>We are searching for 5.</w:t>
+      </w:r>
+    </w:p>
+    <w:p>
+      <w:r>
+        <w:t xml:space="preserve">Binary Search checks the middle element and decides whether to search the </w:t>
+      </w:r>
+      <w:r>
+        <w:rPr>
+          <w:b/>
+          <w:bCs/>
+        </w:rPr>
+        <w:t>left half or right half</w:t>
+      </w:r>
+      <w:r>
+        <w:t>. This makes it much faster than checking every element one by one.</w:t>
+      </w:r>
+    </w:p>
+    <w:p/>
     <w:p>
       <w:r>
         <w:br/>
@@ -6216,7 +9954,6 @@
   <w:style w:type="character" w:default="1" w:styleId="DefaultParagraphFont">
     <w:name w:val="Default Paragraph Font"/>
     <w:uiPriority w:val="1"/>
-    <w:semiHidden/>
     <w:unhideWhenUsed/>
   </w:style>
   <w:style w:type="table" w:default="1" w:styleId="TableNormal">

</xml_diff>